<commit_message>
Completar documento con el despliegue en Vercel y el CV actualizado
Co-Authored-By: Claude Opus 5.5 <noreply@anthropic.com>
</commit_message>
<xml_diff>
--- a/docs/Guias_3.8_G1_G2_CesarElias.docx
+++ b/docs/Guias_3.8_G1_G2_CesarElias.docx
@@ -12,7 +12,7 @@
           <w:noProof/>
         </w:rPr>
         <w:drawing>
-          <wp:inline distT="0" distB="0" distL="0" distR="0" wp14:anchorId="57BC829D" wp14:editId="75EBB432">
+          <wp:inline distT="0" distB="0" distL="0" distR="0" wp14:anchorId="4D0FC215" wp14:editId="7095866E">
             <wp:extent cx="1428750" cy="1419225"/>
             <wp:effectExtent l="0" t="0" r="0" b="0"/>
             <wp:docPr id="1" name="logo" descr="Logo del Colegio Español Padre Arrupe" title="Logo"/>
@@ -288,7 +288,7 @@
       </w:r>
       <w:r>
         <w:tab/>
-        <w:t>pendiente (despliegue en Vercel)</w:t>
+        <w:t>modulo239.vercel.app</w:t>
       </w:r>
     </w:p>
     <w:p>
@@ -314,7 +314,7 @@
     <w:sdt>
       <w:sdtPr>
         <w:alias w:val="Índice"/>
-        <w:id w:val="-1703314774"/>
+        <w:id w:val="-2055062617"/>
       </w:sdtPr>
       <w:sdtEndPr/>
       <w:sdtContent>
@@ -342,7 +342,7 @@
           <w:r>
             <w:fldChar w:fldCharType="separate"/>
           </w:r>
-          <w:hyperlink w:anchor="_Toc241058985" w:history="1">
+          <w:hyperlink w:anchor="_Toc241060411" w:history="1">
             <w:r>
               <w:rPr>
                 <w:rStyle w:val="Hipervnculo"/>
@@ -366,7 +366,7 @@
               <w:rPr>
                 <w:noProof/>
               </w:rPr>
-              <w:instrText xml:space="preserve"> PAGEREF _Toc241058985 \h </w:instrText>
+              <w:instrText xml:space="preserve"> PAGEREF _Toc241060411 \h </w:instrText>
             </w:r>
             <w:r>
               <w:rPr>
@@ -408,7 +408,7 @@
               <w14:ligatures w14:val="standardContextual"/>
             </w:rPr>
           </w:pPr>
-          <w:hyperlink w:anchor="_Toc241058986" w:history="1">
+          <w:hyperlink w:anchor="_Toc241060412" w:history="1">
             <w:r>
               <w:rPr>
                 <w:rStyle w:val="Hipervnculo"/>
@@ -432,7 +432,7 @@
               <w:rPr>
                 <w:noProof/>
               </w:rPr>
-              <w:instrText xml:space="preserve"> PAGEREF _Toc241058986 \h </w:instrText>
+              <w:instrText xml:space="preserve"> PAGEREF _Toc241060412 \h </w:instrText>
             </w:r>
             <w:r>
               <w:rPr>
@@ -474,7 +474,7 @@
               <w14:ligatures w14:val="standardContextual"/>
             </w:rPr>
           </w:pPr>
-          <w:hyperlink w:anchor="_Toc241058987" w:history="1">
+          <w:hyperlink w:anchor="_Toc241060413" w:history="1">
             <w:r>
               <w:rPr>
                 <w:rStyle w:val="Hipervnculo"/>
@@ -498,7 +498,7 @@
               <w:rPr>
                 <w:noProof/>
               </w:rPr>
-              <w:instrText xml:space="preserve"> PAGEREF _Toc241058987 \h </w:instrText>
+              <w:instrText xml:space="preserve"> PAGEREF _Toc241060413 \h </w:instrText>
             </w:r>
             <w:r>
               <w:rPr>
@@ -540,7 +540,7 @@
               <w14:ligatures w14:val="standardContextual"/>
             </w:rPr>
           </w:pPr>
-          <w:hyperlink w:anchor="_Toc241058988" w:history="1">
+          <w:hyperlink w:anchor="_Toc241060414" w:history="1">
             <w:r>
               <w:rPr>
                 <w:rStyle w:val="Hipervnculo"/>
@@ -564,7 +564,7 @@
               <w:rPr>
                 <w:noProof/>
               </w:rPr>
-              <w:instrText xml:space="preserve"> PAGEREF _Toc241058988 \h </w:instrText>
+              <w:instrText xml:space="preserve"> PAGEREF _Toc241060414 \h </w:instrText>
             </w:r>
             <w:r>
               <w:rPr>
@@ -606,7 +606,7 @@
               <w14:ligatures w14:val="standardContextual"/>
             </w:rPr>
           </w:pPr>
-          <w:hyperlink w:anchor="_Toc241058989" w:history="1">
+          <w:hyperlink w:anchor="_Toc241060415" w:history="1">
             <w:r>
               <w:rPr>
                 <w:rStyle w:val="Hipervnculo"/>
@@ -630,7 +630,7 @@
               <w:rPr>
                 <w:noProof/>
               </w:rPr>
-              <w:instrText xml:space="preserve"> PAGEREF _Toc241058989 \h </w:instrText>
+              <w:instrText xml:space="preserve"> PAGEREF _Toc241060415 \h </w:instrText>
             </w:r>
             <w:r>
               <w:rPr>
@@ -672,7 +672,7 @@
               <w14:ligatures w14:val="standardContextual"/>
             </w:rPr>
           </w:pPr>
-          <w:hyperlink w:anchor="_Toc241058990" w:history="1">
+          <w:hyperlink w:anchor="_Toc241060416" w:history="1">
             <w:r>
               <w:rPr>
                 <w:rStyle w:val="Hipervnculo"/>
@@ -696,7 +696,7 @@
               <w:rPr>
                 <w:noProof/>
               </w:rPr>
-              <w:instrText xml:space="preserve"> PAGEREF _Toc241058990 \h </w:instrText>
+              <w:instrText xml:space="preserve"> PAGEREF _Toc241060416 \h </w:instrText>
             </w:r>
             <w:r>
               <w:rPr>
@@ -738,7 +738,7 @@
               <w14:ligatures w14:val="standardContextual"/>
             </w:rPr>
           </w:pPr>
-          <w:hyperlink w:anchor="_Toc241058991" w:history="1">
+          <w:hyperlink w:anchor="_Toc241060417" w:history="1">
             <w:r>
               <w:rPr>
                 <w:rStyle w:val="Hipervnculo"/>
@@ -762,7 +762,7 @@
               <w:rPr>
                 <w:noProof/>
               </w:rPr>
-              <w:instrText xml:space="preserve"> PAGEREF _Toc241058991 \h </w:instrText>
+              <w:instrText xml:space="preserve"> PAGEREF _Toc241060417 \h </w:instrText>
             </w:r>
             <w:r>
               <w:rPr>
@@ -804,7 +804,7 @@
               <w14:ligatures w14:val="standardContextual"/>
             </w:rPr>
           </w:pPr>
-          <w:hyperlink w:anchor="_Toc241058992" w:history="1">
+          <w:hyperlink w:anchor="_Toc241060418" w:history="1">
             <w:r>
               <w:rPr>
                 <w:rStyle w:val="Hipervnculo"/>
@@ -828,7 +828,7 @@
               <w:rPr>
                 <w:noProof/>
               </w:rPr>
-              <w:instrText xml:space="preserve"> PAGEREF _Toc241058992 \h </w:instrText>
+              <w:instrText xml:space="preserve"> PAGEREF _Toc241060418 \h </w:instrText>
             </w:r>
             <w:r>
               <w:rPr>
@@ -870,7 +870,7 @@
               <w14:ligatures w14:val="standardContextual"/>
             </w:rPr>
           </w:pPr>
-          <w:hyperlink w:anchor="_Toc241058993" w:history="1">
+          <w:hyperlink w:anchor="_Toc241060419" w:history="1">
             <w:r>
               <w:rPr>
                 <w:rStyle w:val="Hipervnculo"/>
@@ -894,7 +894,7 @@
               <w:rPr>
                 <w:noProof/>
               </w:rPr>
-              <w:instrText xml:space="preserve"> PAGEREF _Toc241058993 \h </w:instrText>
+              <w:instrText xml:space="preserve"> PAGEREF _Toc241060419 \h </w:instrText>
             </w:r>
             <w:r>
               <w:rPr>
@@ -936,7 +936,7 @@
               <w14:ligatures w14:val="standardContextual"/>
             </w:rPr>
           </w:pPr>
-          <w:hyperlink w:anchor="_Toc241058994" w:history="1">
+          <w:hyperlink w:anchor="_Toc241060420" w:history="1">
             <w:r>
               <w:rPr>
                 <w:rStyle w:val="Hipervnculo"/>
@@ -960,7 +960,7 @@
               <w:rPr>
                 <w:noProof/>
               </w:rPr>
-              <w:instrText xml:space="preserve"> PAGEREF _Toc241058994 \h </w:instrText>
+              <w:instrText xml:space="preserve"> PAGEREF _Toc241060420 \h </w:instrText>
             </w:r>
             <w:r>
               <w:rPr>
@@ -1002,7 +1002,7 @@
               <w14:ligatures w14:val="standardContextual"/>
             </w:rPr>
           </w:pPr>
-          <w:hyperlink w:anchor="_Toc241058995" w:history="1">
+          <w:hyperlink w:anchor="_Toc241060421" w:history="1">
             <w:r>
               <w:rPr>
                 <w:rStyle w:val="Hipervnculo"/>
@@ -1026,7 +1026,7 @@
               <w:rPr>
                 <w:noProof/>
               </w:rPr>
-              <w:instrText xml:space="preserve"> PAGEREF _Toc241058995 \h </w:instrText>
+              <w:instrText xml:space="preserve"> PAGEREF _Toc241060421 \h </w:instrText>
             </w:r>
             <w:r>
               <w:rPr>
@@ -1068,7 +1068,7 @@
               <w14:ligatures w14:val="standardContextual"/>
             </w:rPr>
           </w:pPr>
-          <w:hyperlink w:anchor="_Toc241058996" w:history="1">
+          <w:hyperlink w:anchor="_Toc241060422" w:history="1">
             <w:r>
               <w:rPr>
                 <w:rStyle w:val="Hipervnculo"/>
@@ -1092,7 +1092,7 @@
               <w:rPr>
                 <w:noProof/>
               </w:rPr>
-              <w:instrText xml:space="preserve"> PAGEREF _Toc241058996 \h </w:instrText>
+              <w:instrText xml:space="preserve"> PAGEREF _Toc241060422 \h </w:instrText>
             </w:r>
             <w:r>
               <w:rPr>
@@ -1134,7 +1134,7 @@
               <w14:ligatures w14:val="standardContextual"/>
             </w:rPr>
           </w:pPr>
-          <w:hyperlink w:anchor="_Toc241058997" w:history="1">
+          <w:hyperlink w:anchor="_Toc241060423" w:history="1">
             <w:r>
               <w:rPr>
                 <w:rStyle w:val="Hipervnculo"/>
@@ -1158,7 +1158,7 @@
               <w:rPr>
                 <w:noProof/>
               </w:rPr>
-              <w:instrText xml:space="preserve"> PAGEREF _Toc241058997 \h </w:instrText>
+              <w:instrText xml:space="preserve"> PAGEREF _Toc241060423 \h </w:instrText>
             </w:r>
             <w:r>
               <w:rPr>
@@ -1200,7 +1200,7 @@
               <w14:ligatures w14:val="standardContextual"/>
             </w:rPr>
           </w:pPr>
-          <w:hyperlink w:anchor="_Toc241058998" w:history="1">
+          <w:hyperlink w:anchor="_Toc241060424" w:history="1">
             <w:r>
               <w:rPr>
                 <w:rStyle w:val="Hipervnculo"/>
@@ -1224,7 +1224,7 @@
               <w:rPr>
                 <w:noProof/>
               </w:rPr>
-              <w:instrText xml:space="preserve"> PAGEREF _Toc241058998 \h </w:instrText>
+              <w:instrText xml:space="preserve"> PAGEREF _Toc241060424 \h </w:instrText>
             </w:r>
             <w:r>
               <w:rPr>
@@ -1266,7 +1266,7 @@
               <w14:ligatures w14:val="standardContextual"/>
             </w:rPr>
           </w:pPr>
-          <w:hyperlink w:anchor="_Toc241058999" w:history="1">
+          <w:hyperlink w:anchor="_Toc241060425" w:history="1">
             <w:r>
               <w:rPr>
                 <w:rStyle w:val="Hipervnculo"/>
@@ -1290,7 +1290,7 @@
               <w:rPr>
                 <w:noProof/>
               </w:rPr>
-              <w:instrText xml:space="preserve"> PAGEREF _Toc241058999 \h </w:instrText>
+              <w:instrText xml:space="preserve"> PAGEREF _Toc241060425 \h </w:instrText>
             </w:r>
             <w:r>
               <w:rPr>
@@ -1332,7 +1332,7 @@
               <w14:ligatures w14:val="standardContextual"/>
             </w:rPr>
           </w:pPr>
-          <w:hyperlink w:anchor="_Toc241059000" w:history="1">
+          <w:hyperlink w:anchor="_Toc241060426" w:history="1">
             <w:r>
               <w:rPr>
                 <w:rStyle w:val="Hipervnculo"/>
@@ -1356,7 +1356,7 @@
               <w:rPr>
                 <w:noProof/>
               </w:rPr>
-              <w:instrText xml:space="preserve"> PAGEREF _Toc241059000 \h </w:instrText>
+              <w:instrText xml:space="preserve"> PAGEREF _Toc241060426 \h </w:instrText>
             </w:r>
             <w:r>
               <w:rPr>
@@ -1398,7 +1398,7 @@
               <w14:ligatures w14:val="standardContextual"/>
             </w:rPr>
           </w:pPr>
-          <w:hyperlink w:anchor="_Toc241059001" w:history="1">
+          <w:hyperlink w:anchor="_Toc241060427" w:history="1">
             <w:r>
               <w:rPr>
                 <w:rStyle w:val="Hipervnculo"/>
@@ -1422,7 +1422,7 @@
               <w:rPr>
                 <w:noProof/>
               </w:rPr>
-              <w:instrText xml:space="preserve"> PAGEREF _Toc241059001 \h </w:instrText>
+              <w:instrText xml:space="preserve"> PAGEREF _Toc241060427 \h </w:instrText>
             </w:r>
             <w:r>
               <w:rPr>
@@ -1464,7 +1464,7 @@
               <w14:ligatures w14:val="standardContextual"/>
             </w:rPr>
           </w:pPr>
-          <w:hyperlink w:anchor="_Toc241059002" w:history="1">
+          <w:hyperlink w:anchor="_Toc241060428" w:history="1">
             <w:r>
               <w:rPr>
                 <w:rStyle w:val="Hipervnculo"/>
@@ -1488,7 +1488,7 @@
               <w:rPr>
                 <w:noProof/>
               </w:rPr>
-              <w:instrText xml:space="preserve"> PAGEREF _Toc241059002 \h </w:instrText>
+              <w:instrText xml:space="preserve"> PAGEREF _Toc241060428 \h </w:instrText>
             </w:r>
             <w:r>
               <w:rPr>
@@ -1530,7 +1530,7 @@
               <w14:ligatures w14:val="standardContextual"/>
             </w:rPr>
           </w:pPr>
-          <w:hyperlink w:anchor="_Toc241059003" w:history="1">
+          <w:hyperlink w:anchor="_Toc241060429" w:history="1">
             <w:r>
               <w:rPr>
                 <w:rStyle w:val="Hipervnculo"/>
@@ -1554,7 +1554,7 @@
               <w:rPr>
                 <w:noProof/>
               </w:rPr>
-              <w:instrText xml:space="preserve"> PAGEREF _Toc241059003 \h </w:instrText>
+              <w:instrText xml:space="preserve"> PAGEREF _Toc241060429 \h </w:instrText>
             </w:r>
             <w:r>
               <w:rPr>
@@ -1596,7 +1596,7 @@
               <w14:ligatures w14:val="standardContextual"/>
             </w:rPr>
           </w:pPr>
-          <w:hyperlink w:anchor="_Toc241059004" w:history="1">
+          <w:hyperlink w:anchor="_Toc241060430" w:history="1">
             <w:r>
               <w:rPr>
                 <w:rStyle w:val="Hipervnculo"/>
@@ -1620,7 +1620,7 @@
               <w:rPr>
                 <w:noProof/>
               </w:rPr>
-              <w:instrText xml:space="preserve"> PAGEREF _Toc241059004 \h </w:instrText>
+              <w:instrText xml:space="preserve"> PAGEREF _Toc241060430 \h </w:instrText>
             </w:r>
             <w:r>
               <w:rPr>
@@ -1662,7 +1662,7 @@
               <w14:ligatures w14:val="standardContextual"/>
             </w:rPr>
           </w:pPr>
-          <w:hyperlink w:anchor="_Toc241059005" w:history="1">
+          <w:hyperlink w:anchor="_Toc241060431" w:history="1">
             <w:r>
               <w:rPr>
                 <w:rStyle w:val="Hipervnculo"/>
@@ -1686,7 +1686,7 @@
               <w:rPr>
                 <w:noProof/>
               </w:rPr>
-              <w:instrText xml:space="preserve"> PAGEREF _Toc241059005 \h </w:instrText>
+              <w:instrText xml:space="preserve"> PAGEREF _Toc241060431 \h </w:instrText>
             </w:r>
             <w:r>
               <w:rPr>
@@ -1728,7 +1728,7 @@
               <w14:ligatures w14:val="standardContextual"/>
             </w:rPr>
           </w:pPr>
-          <w:hyperlink w:anchor="_Toc241059006" w:history="1">
+          <w:hyperlink w:anchor="_Toc241060432" w:history="1">
             <w:r>
               <w:rPr>
                 <w:rStyle w:val="Hipervnculo"/>
@@ -1752,7 +1752,7 @@
               <w:rPr>
                 <w:noProof/>
               </w:rPr>
-              <w:instrText xml:space="preserve"> PAGEREF _Toc241059006 \h </w:instrText>
+              <w:instrText xml:space="preserve"> PAGEREF _Toc241060432 \h </w:instrText>
             </w:r>
             <w:r>
               <w:rPr>
@@ -1794,7 +1794,7 @@
               <w14:ligatures w14:val="standardContextual"/>
             </w:rPr>
           </w:pPr>
-          <w:hyperlink w:anchor="_Toc241059007" w:history="1">
+          <w:hyperlink w:anchor="_Toc241060433" w:history="1">
             <w:r>
               <w:rPr>
                 <w:rStyle w:val="Hipervnculo"/>
@@ -1818,7 +1818,7 @@
               <w:rPr>
                 <w:noProof/>
               </w:rPr>
-              <w:instrText xml:space="preserve"> PAGEREF _Toc241059007 \h </w:instrText>
+              <w:instrText xml:space="preserve"> PAGEREF _Toc241060433 \h </w:instrText>
             </w:r>
             <w:r>
               <w:rPr>
@@ -1860,13 +1860,13 @@
               <w14:ligatures w14:val="standardContextual"/>
             </w:rPr>
           </w:pPr>
-          <w:hyperlink w:anchor="_Toc241059008" w:history="1">
+          <w:hyperlink w:anchor="_Toc241060434" w:history="1">
             <w:r>
               <w:rPr>
                 <w:rStyle w:val="Hipervnculo"/>
                 <w:noProof/>
               </w:rPr>
-              <w:t>5. Despliegue en Vercel (pendiente)</w:t>
+              <w:t>5. Cuenta de Vercel e importación del repositorio</w:t>
             </w:r>
             <w:r>
               <w:rPr>
@@ -1884,7 +1884,7 @@
               <w:rPr>
                 <w:noProof/>
               </w:rPr>
-              <w:instrText xml:space="preserve"> PAGEREF _Toc241059008 \h </w:instrText>
+              <w:instrText xml:space="preserve"> PAGEREF _Toc241060434 \h </w:instrText>
             </w:r>
             <w:r>
               <w:rPr>
@@ -1902,6 +1902,204 @@
                 <w:noProof/>
               </w:rPr>
               <w:t>20</w:t>
+            </w:r>
+            <w:r>
+              <w:rPr>
+                <w:noProof/>
+              </w:rPr>
+              <w:fldChar w:fldCharType="end"/>
+            </w:r>
+          </w:hyperlink>
+        </w:p>
+        <w:p>
+          <w:pPr>
+            <w:pStyle w:val="TDC3"/>
+            <w:tabs>
+              <w:tab w:val="right" w:leader="dot" w:pos="9628"/>
+            </w:tabs>
+            <w:rPr>
+              <w:rFonts w:asciiTheme="minorHAnsi" w:eastAsiaTheme="minorEastAsia" w:hAnsiTheme="minorHAnsi" w:cstheme="minorBidi"/>
+              <w:noProof/>
+              <w:kern w:val="2"/>
+              <w:sz w:val="24"/>
+              <w:szCs w:val="24"/>
+              <w14:ligatures w14:val="standardContextual"/>
+            </w:rPr>
+          </w:pPr>
+          <w:hyperlink w:anchor="_Toc241060435" w:history="1">
+            <w:r>
+              <w:rPr>
+                <w:rStyle w:val="Hipervnculo"/>
+                <w:noProof/>
+              </w:rPr>
+              <w:t>6. Primer despliegue</w:t>
+            </w:r>
+            <w:r>
+              <w:rPr>
+                <w:noProof/>
+              </w:rPr>
+              <w:tab/>
+            </w:r>
+            <w:r>
+              <w:rPr>
+                <w:noProof/>
+              </w:rPr>
+              <w:fldChar w:fldCharType="begin"/>
+            </w:r>
+            <w:r>
+              <w:rPr>
+                <w:noProof/>
+              </w:rPr>
+              <w:instrText xml:space="preserve"> PAGEREF _Toc241060435 \h </w:instrText>
+            </w:r>
+            <w:r>
+              <w:rPr>
+                <w:noProof/>
+              </w:rPr>
+            </w:r>
+            <w:r>
+              <w:rPr>
+                <w:noProof/>
+              </w:rPr>
+              <w:fldChar w:fldCharType="separate"/>
+            </w:r>
+            <w:r>
+              <w:rPr>
+                <w:noProof/>
+              </w:rPr>
+              <w:t>20</w:t>
+            </w:r>
+            <w:r>
+              <w:rPr>
+                <w:noProof/>
+              </w:rPr>
+              <w:fldChar w:fldCharType="end"/>
+            </w:r>
+          </w:hyperlink>
+        </w:p>
+        <w:p>
+          <w:pPr>
+            <w:pStyle w:val="TDC3"/>
+            <w:tabs>
+              <w:tab w:val="right" w:leader="dot" w:pos="9628"/>
+            </w:tabs>
+            <w:rPr>
+              <w:rFonts w:asciiTheme="minorHAnsi" w:eastAsiaTheme="minorEastAsia" w:hAnsiTheme="minorHAnsi" w:cstheme="minorBidi"/>
+              <w:noProof/>
+              <w:kern w:val="2"/>
+              <w:sz w:val="24"/>
+              <w:szCs w:val="24"/>
+              <w14:ligatures w14:val="standardContextual"/>
+            </w:rPr>
+          </w:pPr>
+          <w:hyperlink w:anchor="_Toc241060436" w:history="1">
+            <w:r>
+              <w:rPr>
+                <w:rStyle w:val="Hipervnculo"/>
+                <w:noProof/>
+              </w:rPr>
+              <w:t>7. Sitio en producción</w:t>
+            </w:r>
+            <w:r>
+              <w:rPr>
+                <w:noProof/>
+              </w:rPr>
+              <w:tab/>
+            </w:r>
+            <w:r>
+              <w:rPr>
+                <w:noProof/>
+              </w:rPr>
+              <w:fldChar w:fldCharType="begin"/>
+            </w:r>
+            <w:r>
+              <w:rPr>
+                <w:noProof/>
+              </w:rPr>
+              <w:instrText xml:space="preserve"> PAGEREF _Toc241060436 \h </w:instrText>
+            </w:r>
+            <w:r>
+              <w:rPr>
+                <w:noProof/>
+              </w:rPr>
+            </w:r>
+            <w:r>
+              <w:rPr>
+                <w:noProof/>
+              </w:rPr>
+              <w:fldChar w:fldCharType="separate"/>
+            </w:r>
+            <w:r>
+              <w:rPr>
+                <w:noProof/>
+              </w:rPr>
+              <w:t>21</w:t>
+            </w:r>
+            <w:r>
+              <w:rPr>
+                <w:noProof/>
+              </w:rPr>
+              <w:fldChar w:fldCharType="end"/>
+            </w:r>
+          </w:hyperlink>
+        </w:p>
+        <w:p>
+          <w:pPr>
+            <w:pStyle w:val="TDC3"/>
+            <w:tabs>
+              <w:tab w:val="right" w:leader="dot" w:pos="9628"/>
+            </w:tabs>
+            <w:rPr>
+              <w:rFonts w:asciiTheme="minorHAnsi" w:eastAsiaTheme="minorEastAsia" w:hAnsiTheme="minorHAnsi" w:cstheme="minorBidi"/>
+              <w:noProof/>
+              <w:kern w:val="2"/>
+              <w:sz w:val="24"/>
+              <w:szCs w:val="24"/>
+              <w14:ligatures w14:val="standardContextual"/>
+            </w:rPr>
+          </w:pPr>
+          <w:hyperlink w:anchor="_Toc241060437" w:history="1">
+            <w:r>
+              <w:rPr>
+                <w:rStyle w:val="Hipervnculo"/>
+                <w:noProof/>
+              </w:rPr>
+              <w:t>8. Actualización mediante un nuevo despliegue</w:t>
+            </w:r>
+            <w:r>
+              <w:rPr>
+                <w:noProof/>
+              </w:rPr>
+              <w:tab/>
+            </w:r>
+            <w:r>
+              <w:rPr>
+                <w:noProof/>
+              </w:rPr>
+              <w:fldChar w:fldCharType="begin"/>
+            </w:r>
+            <w:r>
+              <w:rPr>
+                <w:noProof/>
+              </w:rPr>
+              <w:instrText xml:space="preserve"> PAGEREF _Toc241060437 \h </w:instrText>
+            </w:r>
+            <w:r>
+              <w:rPr>
+                <w:noProof/>
+              </w:rPr>
+            </w:r>
+            <w:r>
+              <w:rPr>
+                <w:noProof/>
+              </w:rPr>
+              <w:fldChar w:fldCharType="separate"/>
+            </w:r>
+            <w:r>
+              <w:rPr>
+                <w:noProof/>
+              </w:rPr>
+              <w:t>21</w:t>
             </w:r>
             <w:r>
               <w:rPr>
@@ -1926,7 +2124,7 @@
               <w14:ligatures w14:val="standardContextual"/>
             </w:rPr>
           </w:pPr>
-          <w:hyperlink w:anchor="_Toc241059009" w:history="1">
+          <w:hyperlink w:anchor="_Toc241060438" w:history="1">
             <w:r>
               <w:rPr>
                 <w:rStyle w:val="Hipervnculo"/>
@@ -1950,7 +2148,7 @@
               <w:rPr>
                 <w:noProof/>
               </w:rPr>
-              <w:instrText xml:space="preserve"> PAGEREF _Toc241059009 \h </w:instrText>
+              <w:instrText xml:space="preserve"> PAGEREF _Toc241060438 \h </w:instrText>
             </w:r>
             <w:r>
               <w:rPr>
@@ -1967,7 +2165,205 @@
               <w:rPr>
                 <w:noProof/>
               </w:rPr>
-              <w:t>20</w:t>
+              <w:t>23</w:t>
+            </w:r>
+            <w:r>
+              <w:rPr>
+                <w:noProof/>
+              </w:rPr>
+              <w:fldChar w:fldCharType="end"/>
+            </w:r>
+          </w:hyperlink>
+        </w:p>
+        <w:p>
+          <w:pPr>
+            <w:pStyle w:val="TDC3"/>
+            <w:tabs>
+              <w:tab w:val="right" w:leader="dot" w:pos="9628"/>
+            </w:tabs>
+            <w:rPr>
+              <w:rFonts w:asciiTheme="minorHAnsi" w:eastAsiaTheme="minorEastAsia" w:hAnsiTheme="minorHAnsi" w:cstheme="minorBidi"/>
+              <w:noProof/>
+              <w:kern w:val="2"/>
+              <w:sz w:val="24"/>
+              <w:szCs w:val="24"/>
+              <w14:ligatures w14:val="standardContextual"/>
+            </w:rPr>
+          </w:pPr>
+          <w:hyperlink w:anchor="_Toc241060439" w:history="1">
+            <w:r>
+              <w:rPr>
+                <w:rStyle w:val="Hipervnculo"/>
+                <w:noProof/>
+              </w:rPr>
+              <w:t>Currículum vitae y hoja de vida</w:t>
+            </w:r>
+            <w:r>
+              <w:rPr>
+                <w:noProof/>
+              </w:rPr>
+              <w:tab/>
+            </w:r>
+            <w:r>
+              <w:rPr>
+                <w:noProof/>
+              </w:rPr>
+              <w:fldChar w:fldCharType="begin"/>
+            </w:r>
+            <w:r>
+              <w:rPr>
+                <w:noProof/>
+              </w:rPr>
+              <w:instrText xml:space="preserve"> PAGEREF _Toc241060439 \h </w:instrText>
+            </w:r>
+            <w:r>
+              <w:rPr>
+                <w:noProof/>
+              </w:rPr>
+            </w:r>
+            <w:r>
+              <w:rPr>
+                <w:noProof/>
+              </w:rPr>
+              <w:fldChar w:fldCharType="separate"/>
+            </w:r>
+            <w:r>
+              <w:rPr>
+                <w:noProof/>
+              </w:rPr>
+              <w:t>23</w:t>
+            </w:r>
+            <w:r>
+              <w:rPr>
+                <w:noProof/>
+              </w:rPr>
+              <w:fldChar w:fldCharType="end"/>
+            </w:r>
+          </w:hyperlink>
+        </w:p>
+        <w:p>
+          <w:pPr>
+            <w:pStyle w:val="TDC3"/>
+            <w:tabs>
+              <w:tab w:val="right" w:leader="dot" w:pos="9628"/>
+            </w:tabs>
+            <w:rPr>
+              <w:rFonts w:asciiTheme="minorHAnsi" w:eastAsiaTheme="minorEastAsia" w:hAnsiTheme="minorHAnsi" w:cstheme="minorBidi"/>
+              <w:noProof/>
+              <w:kern w:val="2"/>
+              <w:sz w:val="24"/>
+              <w:szCs w:val="24"/>
+              <w14:ligatures w14:val="standardContextual"/>
+            </w:rPr>
+          </w:pPr>
+          <w:hyperlink w:anchor="_Toc241060440" w:history="1">
+            <w:r>
+              <w:rPr>
+                <w:rStyle w:val="Hipervnculo"/>
+                <w:noProof/>
+              </w:rPr>
+              <w:t>GitHub</w:t>
+            </w:r>
+            <w:r>
+              <w:rPr>
+                <w:noProof/>
+              </w:rPr>
+              <w:tab/>
+            </w:r>
+            <w:r>
+              <w:rPr>
+                <w:noProof/>
+              </w:rPr>
+              <w:fldChar w:fldCharType="begin"/>
+            </w:r>
+            <w:r>
+              <w:rPr>
+                <w:noProof/>
+              </w:rPr>
+              <w:instrText xml:space="preserve"> PAGEREF _Toc241060440 \h </w:instrText>
+            </w:r>
+            <w:r>
+              <w:rPr>
+                <w:noProof/>
+              </w:rPr>
+            </w:r>
+            <w:r>
+              <w:rPr>
+                <w:noProof/>
+              </w:rPr>
+              <w:fldChar w:fldCharType="separate"/>
+            </w:r>
+            <w:r>
+              <w:rPr>
+                <w:noProof/>
+              </w:rPr>
+              <w:t>24</w:t>
+            </w:r>
+            <w:r>
+              <w:rPr>
+                <w:noProof/>
+              </w:rPr>
+              <w:fldChar w:fldCharType="end"/>
+            </w:r>
+          </w:hyperlink>
+        </w:p>
+        <w:p>
+          <w:pPr>
+            <w:pStyle w:val="TDC3"/>
+            <w:tabs>
+              <w:tab w:val="right" w:leader="dot" w:pos="9628"/>
+            </w:tabs>
+            <w:rPr>
+              <w:rFonts w:asciiTheme="minorHAnsi" w:eastAsiaTheme="minorEastAsia" w:hAnsiTheme="minorHAnsi" w:cstheme="minorBidi"/>
+              <w:noProof/>
+              <w:kern w:val="2"/>
+              <w:sz w:val="24"/>
+              <w:szCs w:val="24"/>
+              <w14:ligatures w14:val="standardContextual"/>
+            </w:rPr>
+          </w:pPr>
+          <w:hyperlink w:anchor="_Toc241060441" w:history="1">
+            <w:r>
+              <w:rPr>
+                <w:rStyle w:val="Hipervnculo"/>
+                <w:noProof/>
+              </w:rPr>
+              <w:t>LinkedIn</w:t>
+            </w:r>
+            <w:r>
+              <w:rPr>
+                <w:noProof/>
+              </w:rPr>
+              <w:tab/>
+            </w:r>
+            <w:r>
+              <w:rPr>
+                <w:noProof/>
+              </w:rPr>
+              <w:fldChar w:fldCharType="begin"/>
+            </w:r>
+            <w:r>
+              <w:rPr>
+                <w:noProof/>
+              </w:rPr>
+              <w:instrText xml:space="preserve"> PAGEREF _Toc241060441 \h </w:instrText>
+            </w:r>
+            <w:r>
+              <w:rPr>
+                <w:noProof/>
+              </w:rPr>
+            </w:r>
+            <w:r>
+              <w:rPr>
+                <w:noProof/>
+              </w:rPr>
+              <w:fldChar w:fldCharType="separate"/>
+            </w:r>
+            <w:r>
+              <w:rPr>
+                <w:noProof/>
+              </w:rPr>
+              <w:t>24</w:t>
             </w:r>
             <w:r>
               <w:rPr>
@@ -1992,7 +2388,7 @@
               <w14:ligatures w14:val="standardContextual"/>
             </w:rPr>
           </w:pPr>
-          <w:hyperlink w:anchor="_Toc241059010" w:history="1">
+          <w:hyperlink w:anchor="_Toc241060442" w:history="1">
             <w:r>
               <w:rPr>
                 <w:rStyle w:val="Hipervnculo"/>
@@ -2016,7 +2412,7 @@
               <w:rPr>
                 <w:noProof/>
               </w:rPr>
-              <w:instrText xml:space="preserve"> PAGEREF _Toc241059010 \h </w:instrText>
+              <w:instrText xml:space="preserve"> PAGEREF _Toc241060442 \h </w:instrText>
             </w:r>
             <w:r>
               <w:rPr>
@@ -2033,7 +2429,7 @@
               <w:rPr>
                 <w:noProof/>
               </w:rPr>
-              <w:t>22</w:t>
+              <w:t>25</w:t>
             </w:r>
             <w:r>
               <w:rPr>
@@ -2058,7 +2454,7 @@
               <w14:ligatures w14:val="standardContextual"/>
             </w:rPr>
           </w:pPr>
-          <w:hyperlink w:anchor="_Toc241059011" w:history="1">
+          <w:hyperlink w:anchor="_Toc241060443" w:history="1">
             <w:r>
               <w:rPr>
                 <w:rStyle w:val="Hipervnculo"/>
@@ -2082,7 +2478,7 @@
               <w:rPr>
                 <w:noProof/>
               </w:rPr>
-              <w:instrText xml:space="preserve"> PAGEREF _Toc241059011 \h </w:instrText>
+              <w:instrText xml:space="preserve"> PAGEREF _Toc241060443 \h </w:instrText>
             </w:r>
             <w:r>
               <w:rPr>
@@ -2099,7 +2495,7 @@
               <w:rPr>
                 <w:noProof/>
               </w:rPr>
-              <w:t>22</w:t>
+              <w:t>25</w:t>
             </w:r>
             <w:r>
               <w:rPr>
@@ -2124,7 +2520,7 @@
               <w14:ligatures w14:val="standardContextual"/>
             </w:rPr>
           </w:pPr>
-          <w:hyperlink w:anchor="_Toc241059012" w:history="1">
+          <w:hyperlink w:anchor="_Toc241060444" w:history="1">
             <w:r>
               <w:rPr>
                 <w:rStyle w:val="Hipervnculo"/>
@@ -2148,7 +2544,7 @@
               <w:rPr>
                 <w:noProof/>
               </w:rPr>
-              <w:instrText xml:space="preserve"> PAGEREF _Toc241059012 \h </w:instrText>
+              <w:instrText xml:space="preserve"> PAGEREF _Toc241060444 \h </w:instrText>
             </w:r>
             <w:r>
               <w:rPr>
@@ -2165,7 +2561,7 @@
               <w:rPr>
                 <w:noProof/>
               </w:rPr>
-              <w:t>22</w:t>
+              <w:t>25</w:t>
             </w:r>
             <w:r>
               <w:rPr>
@@ -2191,7 +2587,7 @@
       <w:pPr>
         <w:pStyle w:val="Ttulo1"/>
       </w:pPr>
-      <w:bookmarkStart w:id="0" w:name="_Toc241058985"/>
+      <w:bookmarkStart w:id="0" w:name="_Toc241060411"/>
       <w:r>
         <w:t>Introducción</w:t>
       </w:r>
@@ -2222,7 +2618,7 @@
         <w:t>Guía 2</w:t>
       </w:r>
       <w:r>
-        <w:t xml:space="preserve"> ese portafolio se subió a GitHub con Git; el despliegue en Vercel queda pendiente porque requiere que el estudiante inicie sesión en Vercel con su cuenta.</w:t>
+        <w:t xml:space="preserve"> ese portafolio se subió a GitHub con Git y se desplegó en Vercel, de modo que cada nuevo push publica automáticamente una versión actualizada.</w:t>
       </w:r>
     </w:p>
     <w:p>
@@ -2250,7 +2646,7 @@
         <w:pStyle w:val="Ttulo1"/>
         <w:pageBreakBefore/>
       </w:pPr>
-      <w:bookmarkStart w:id="1" w:name="_Toc241058986"/>
+      <w:bookmarkStart w:id="1" w:name="_Toc241060412"/>
       <w:r>
         <w:t>Guía 1 – Portafolio profesional con Next.js</w:t>
       </w:r>
@@ -2263,7 +2659,7 @@
         <w:spacing w:before="320" w:after="200"/>
         <w:jc w:val="center"/>
       </w:pPr>
-      <w:bookmarkStart w:id="2" w:name="_Toc241058987"/>
+      <w:bookmarkStart w:id="2" w:name="_Toc241060413"/>
       <w:r>
         <w:rPr>
           <w:color w:val="FFFFFF"/>
@@ -2359,7 +2755,7 @@
         <w:spacing w:before="320" w:after="200"/>
         <w:jc w:val="center"/>
       </w:pPr>
-      <w:bookmarkStart w:id="3" w:name="_Toc241058988"/>
+      <w:bookmarkStart w:id="3" w:name="_Toc241060414"/>
       <w:r>
         <w:rPr>
           <w:color w:val="FFFFFF"/>
@@ -2374,7 +2770,7 @@
       <w:pPr>
         <w:pStyle w:val="Ttulo3"/>
       </w:pPr>
-      <w:bookmarkStart w:id="4" w:name="_Toc241058989"/>
+      <w:bookmarkStart w:id="4" w:name="_Toc241060415"/>
       <w:r>
         <w:t>1. Verificación de Node.js y npm</w:t>
       </w:r>
@@ -2443,10 +2839,10 @@
           <w:noProof/>
         </w:rPr>
         <w:drawing>
-          <wp:inline distT="0" distB="0" distL="0" distR="0" wp14:anchorId="6E6CE955" wp14:editId="634055CB">
+          <wp:inline distT="0" distB="0" distL="0" distR="0" wp14:anchorId="33530BE5" wp14:editId="13FC1341">
             <wp:extent cx="4953000" cy="1952625"/>
             <wp:effectExtent l="0" t="0" r="0" b="0"/>
-            <wp:docPr id="1631987205" name="g1_01_node_npm.png" descr="Versiones de Node.js y npm instaladas." title="Versiones de Node.js y npm instaladas."/>
+            <wp:docPr id="32210983" name="g1_01_node_npm.png" descr="Versiones de Node.js y npm instaladas." title="Versiones de Node.js y npm instaladas."/>
             <wp:cNvGraphicFramePr>
               <a:graphicFrameLocks xmlns:a="http://schemas.openxmlformats.org/drawingml/2006/main" noChangeAspect="1"/>
             </wp:cNvGraphicFramePr>
@@ -2512,7 +2908,7 @@
       <w:pPr>
         <w:pStyle w:val="Ttulo3"/>
       </w:pPr>
-      <w:bookmarkStart w:id="5" w:name="_Toc241058990"/>
+      <w:bookmarkStart w:id="5" w:name="_Toc241060416"/>
       <w:r>
         <w:t>2. Creación del proyecto con create-next-app</w:t>
       </w:r>
@@ -2621,10 +3017,10 @@
           <w:noProof/>
         </w:rPr>
         <w:drawing>
-          <wp:inline distT="0" distB="0" distL="0" distR="0" wp14:anchorId="36282696" wp14:editId="3D5D1A2A">
+          <wp:inline distT="0" distB="0" distL="0" distR="0" wp14:anchorId="487B6DE5" wp14:editId="4233B665">
             <wp:extent cx="5715000" cy="4352925"/>
             <wp:effectExtent l="0" t="0" r="0" b="0"/>
-            <wp:docPr id="857760834" name="g1_02_create_next_app.png" descr="Instalación de dependencias y creación del proyecto cesarportafolio." title="Instalación de dependencias y creación del proyecto cesarportafolio."/>
+            <wp:docPr id="573623902" name="g1_02_create_next_app.png" descr="Instalación de dependencias y creación del proyecto cesarportafolio." title="Instalación de dependencias y creación del proyecto cesarportafolio."/>
             <wp:cNvGraphicFramePr>
               <a:graphicFrameLocks xmlns:a="http://schemas.openxmlformats.org/drawingml/2006/main" noChangeAspect="1"/>
             </wp:cNvGraphicFramePr>
@@ -2690,7 +3086,7 @@
       <w:pPr>
         <w:pStyle w:val="Ttulo3"/>
       </w:pPr>
-      <w:bookmarkStart w:id="6" w:name="_Toc241058991"/>
+      <w:bookmarkStart w:id="6" w:name="_Toc241060417"/>
       <w:r>
         <w:t>3. Estructura del proyecto</w:t>
       </w:r>
@@ -2739,10 +3135,10 @@
           <w:noProof/>
         </w:rPr>
         <w:drawing>
-          <wp:inline distT="0" distB="0" distL="0" distR="0" wp14:anchorId="37C196A6" wp14:editId="18BD2C88">
+          <wp:inline distT="0" distB="0" distL="0" distR="0" wp14:anchorId="54E9101D" wp14:editId="0C1C170F">
             <wp:extent cx="5334000" cy="3267075"/>
             <wp:effectExtent l="0" t="0" r="0" b="0"/>
-            <wp:docPr id="1336893138" name="g1_03_dir.png" descr="Archivos y carpetas generados por create-next-app." title="Archivos y carpetas generados por create-next-app."/>
+            <wp:docPr id="2083699683" name="g1_03_dir.png" descr="Archivos y carpetas generados por create-next-app." title="Archivos y carpetas generados por create-next-app."/>
             <wp:cNvGraphicFramePr>
               <a:graphicFrameLocks xmlns:a="http://schemas.openxmlformats.org/drawingml/2006/main" noChangeAspect="1"/>
             </wp:cNvGraphicFramePr>
@@ -3026,7 +3422,7 @@
       <w:pPr>
         <w:pStyle w:val="Ttulo3"/>
       </w:pPr>
-      <w:bookmarkStart w:id="7" w:name="_Toc241058992"/>
+      <w:bookmarkStart w:id="7" w:name="_Toc241060418"/>
       <w:r>
         <w:t>4. Ejecución del servidor de desarrollo</w:t>
       </w:r>
@@ -3218,10 +3614,10 @@
           <w:noProof/>
         </w:rPr>
         <w:drawing>
-          <wp:inline distT="0" distB="0" distL="0" distR="0" wp14:anchorId="2C622929" wp14:editId="4CD1D5DF">
+          <wp:inline distT="0" distB="0" distL="0" distR="0" wp14:anchorId="2CAD4ADB" wp14:editId="0F1D7413">
             <wp:extent cx="5334000" cy="2085975"/>
             <wp:effectExtent l="0" t="0" r="0" b="0"/>
-            <wp:docPr id="1910856437" name="g1_04_npm_run_dev.png" descr="Servidor de desarrollo listo en localhost:3000." title="Servidor de desarrollo listo en localhost:3000."/>
+            <wp:docPr id="598934848" name="g1_04_npm_run_dev.png" descr="Servidor de desarrollo listo en localhost:3000." title="Servidor de desarrollo listo en localhost:3000."/>
             <wp:cNvGraphicFramePr>
               <a:graphicFrameLocks xmlns:a="http://schemas.openxmlformats.org/drawingml/2006/main" noChangeAspect="1"/>
             </wp:cNvGraphicFramePr>
@@ -3287,7 +3683,7 @@
       <w:pPr>
         <w:pStyle w:val="Ttulo3"/>
       </w:pPr>
-      <w:bookmarkStart w:id="8" w:name="_Toc241058993"/>
+      <w:bookmarkStart w:id="8" w:name="_Toc241060419"/>
       <w:r>
         <w:t>5. Página inicial en el navegador</w:t>
       </w:r>
@@ -3324,10 +3720,10 @@
           <w:noProof/>
         </w:rPr>
         <w:drawing>
-          <wp:inline distT="0" distB="0" distL="0" distR="0" wp14:anchorId="2906ACE5" wp14:editId="0023A1B7">
+          <wp:inline distT="0" distB="0" distL="0" distR="0" wp14:anchorId="77FABF70" wp14:editId="698F10EA">
             <wp:extent cx="5715000" cy="3790950"/>
             <wp:effectExtent l="0" t="0" r="0" b="0"/>
-            <wp:docPr id="585067063" name="g1_05_localhost_default.png" descr="Página inicial generada por Next.js." title="Página inicial generada por Next.js."/>
+            <wp:docPr id="1580517830" name="g1_05_localhost_default.png" descr="Página inicial generada por Next.js." title="Página inicial generada por Next.js."/>
             <wp:cNvGraphicFramePr>
               <a:graphicFrameLocks xmlns:a="http://schemas.openxmlformats.org/drawingml/2006/main" noChangeAspect="1"/>
             </wp:cNvGraphicFramePr>
@@ -3438,10 +3834,10 @@
           <w:noProof/>
         </w:rPr>
         <w:drawing>
-          <wp:inline distT="0" distB="0" distL="0" distR="0" wp14:anchorId="71FF98C2" wp14:editId="75943BEB">
+          <wp:inline distT="0" distB="0" distL="0" distR="0" wp14:anchorId="3088CA22" wp14:editId="0ABF4E20">
             <wp:extent cx="5715000" cy="3790950"/>
             <wp:effectExtent l="0" t="0" r="0" b="0"/>
-            <wp:docPr id="1363516350" name="g1_06_next_devtools.png" descr="Consola de desarrollo de Next.js: ruta estática y Turbopack." title="Consola de desarrollo de Next.js: ruta estática y Turbopack."/>
+            <wp:docPr id="551896555" name="g1_06_next_devtools.png" descr="Consola de desarrollo de Next.js: ruta estática y Turbopack." title="Consola de desarrollo de Next.js: ruta estática y Turbopack."/>
             <wp:cNvGraphicFramePr>
               <a:graphicFrameLocks xmlns:a="http://schemas.openxmlformats.org/drawingml/2006/main" noChangeAspect="1"/>
             </wp:cNvGraphicFramePr>
@@ -3507,7 +3903,7 @@
       <w:pPr>
         <w:pStyle w:val="Ttulo3"/>
       </w:pPr>
-      <w:bookmarkStart w:id="9" w:name="_Toc241058994"/>
+      <w:bookmarkStart w:id="9" w:name="_Toc241060420"/>
       <w:r>
         <w:t>6. Primera modificación de page.tsx</w:t>
       </w:r>
@@ -3885,10 +4281,10 @@
           <w:noProof/>
         </w:rPr>
         <w:drawing>
-          <wp:inline distT="0" distB="0" distL="0" distR="0" wp14:anchorId="52CB8EBF" wp14:editId="66301046">
+          <wp:inline distT="0" distB="0" distL="0" distR="0" wp14:anchorId="6824D7F2" wp14:editId="687D5333">
             <wp:extent cx="5715000" cy="3438525"/>
             <wp:effectExtent l="0" t="0" r="0" b="0"/>
-            <wp:docPr id="1900798191" name="g1_07_vscode_page_tsx.png" descr="Archivo page.tsx modificado en Visual Studio Code." title="Archivo page.tsx modificado en Visual Studio Code."/>
+            <wp:docPr id="1108322300" name="g1_07_vscode_page_tsx.png" descr="Archivo page.tsx modificado en Visual Studio Code." title="Archivo page.tsx modificado en Visual Studio Code."/>
             <wp:cNvGraphicFramePr>
               <a:graphicFrameLocks xmlns:a="http://schemas.openxmlformats.org/drawingml/2006/main" noChangeAspect="1"/>
             </wp:cNvGraphicFramePr>
@@ -3969,10 +4365,10 @@
           <w:noProof/>
         </w:rPr>
         <w:drawing>
-          <wp:inline distT="0" distB="0" distL="0" distR="0" wp14:anchorId="5CED33EE" wp14:editId="12EE1DE3">
+          <wp:inline distT="0" distB="0" distL="0" distR="0" wp14:anchorId="2AEDC822" wp14:editId="7F239CCF">
             <wp:extent cx="5715000" cy="3790950"/>
             <wp:effectExtent l="0" t="0" r="0" b="0"/>
-            <wp:docPr id="475132056" name="g1_08_demo_cesarportafolio.png" descr="Resultado de la primera modificación." title="Resultado de la primera modificación."/>
+            <wp:docPr id="2006571410" name="g1_08_demo_cesarportafolio.png" descr="Resultado de la primera modificación." title="Resultado de la primera modificación."/>
             <wp:cNvGraphicFramePr>
               <a:graphicFrameLocks xmlns:a="http://schemas.openxmlformats.org/drawingml/2006/main" noChangeAspect="1"/>
             </wp:cNvGraphicFramePr>
@@ -4038,7 +4434,7 @@
       <w:pPr>
         <w:pStyle w:val="Ttulo3"/>
       </w:pPr>
-      <w:bookmarkStart w:id="10" w:name="_Toc241058995"/>
+      <w:bookmarkStart w:id="10" w:name="_Toc241060421"/>
       <w:r>
         <w:t>7. Consola de errores de Next.js</w:t>
       </w:r>
@@ -4109,10 +4505,10 @@
           <w:noProof/>
         </w:rPr>
         <w:drawing>
-          <wp:inline distT="0" distB="0" distL="0" distR="0" wp14:anchorId="53FD3A92" wp14:editId="34BCDA37">
+          <wp:inline distT="0" distB="0" distL="0" distR="0" wp14:anchorId="1443B6F3" wp14:editId="04CE4499">
             <wp:extent cx="5715000" cy="3790950"/>
             <wp:effectExtent l="0" t="0" r="0" b="0"/>
-            <wp:docPr id="1707529678" name="g1_09_error_overlay.png" descr="Error de compilación detectado por la consola de Next.js." title="Error de compilación detectado por la consola de Next.js."/>
+            <wp:docPr id="219912444" name="g1_09_error_overlay.png" descr="Error de compilación detectado por la consola de Next.js." title="Error de compilación detectado por la consola de Next.js."/>
             <wp:cNvGraphicFramePr>
               <a:graphicFrameLocks xmlns:a="http://schemas.openxmlformats.org/drawingml/2006/main" noChangeAspect="1"/>
             </wp:cNvGraphicFramePr>
@@ -4181,7 +4577,7 @@
         <w:spacing w:before="320" w:after="200"/>
         <w:jc w:val="center"/>
       </w:pPr>
-      <w:bookmarkStart w:id="11" w:name="_Toc241058996"/>
+      <w:bookmarkStart w:id="11" w:name="_Toc241060422"/>
       <w:r>
         <w:rPr>
           <w:color w:val="FFFFFF"/>
@@ -4214,7 +4610,7 @@
       <w:pPr>
         <w:pStyle w:val="Ttulo3"/>
       </w:pPr>
-      <w:bookmarkStart w:id="12" w:name="_Toc241058997"/>
+      <w:bookmarkStart w:id="12" w:name="_Toc241060423"/>
       <w:r>
         <w:t>Diseño</w:t>
       </w:r>
@@ -4325,7 +4721,7 @@
       <w:pPr>
         <w:pStyle w:val="Ttulo3"/>
       </w:pPr>
-      <w:bookmarkStart w:id="13" w:name="_Toc241058998"/>
+      <w:bookmarkStart w:id="13" w:name="_Toc241060424"/>
       <w:r>
         <w:t>Conceptos de la guía aplicados</w:t>
       </w:r>
@@ -5336,7 +5732,7 @@
       <w:pPr>
         <w:pStyle w:val="Ttulo3"/>
       </w:pPr>
-      <w:bookmarkStart w:id="14" w:name="_Toc241058999"/>
+      <w:bookmarkStart w:id="14" w:name="_Toc241060425"/>
       <w:r>
         <w:t>Resultado</w:t>
       </w:r>
@@ -5353,10 +5749,10 @@
           <w:noProof/>
         </w:rPr>
         <w:drawing>
-          <wp:inline distT="0" distB="0" distL="0" distR="0" wp14:anchorId="4C0C4E64" wp14:editId="0F282713">
+          <wp:inline distT="0" distB="0" distL="0" distR="0" wp14:anchorId="782A5D86" wp14:editId="0C52C383">
             <wp:extent cx="5715000" cy="3790950"/>
             <wp:effectExtent l="0" t="0" r="0" b="0"/>
-            <wp:docPr id="197786388" name="g1_10_portafolio_inicio.png" descr="Sección de inicio con foto, presentación y datos destacados." title="Sección de inicio con foto, presentación y datos destacados."/>
+            <wp:docPr id="780318314" name="g1_10_portafolio_inicio.png" descr="Sección de inicio con foto, presentación y datos destacados." title="Sección de inicio con foto, presentación y datos destacados."/>
             <wp:cNvGraphicFramePr>
               <a:graphicFrameLocks xmlns:a="http://schemas.openxmlformats.org/drawingml/2006/main" noChangeAspect="1"/>
             </wp:cNvGraphicFramePr>
@@ -5429,10 +5825,10 @@
           <w:noProof/>
         </w:rPr>
         <w:drawing>
-          <wp:inline distT="0" distB="0" distL="0" distR="0" wp14:anchorId="126FC817" wp14:editId="655BD912">
+          <wp:inline distT="0" distB="0" distL="0" distR="0" wp14:anchorId="5E23265F" wp14:editId="0583E3AE">
             <wp:extent cx="5715000" cy="3790950"/>
             <wp:effectExtent l="0" t="0" r="0" b="0"/>
-            <wp:docPr id="2140996430" name="g1_11_portafolio_sobre_mi.png" descr="Sección &quot;Sobre mí&quot;." title="Sección &quot;Sobre mí&quot;."/>
+            <wp:docPr id="1878682028" name="g1_11_portafolio_sobre_mi.png" descr="Sección &quot;Sobre mí&quot;." title="Sección &quot;Sobre mí&quot;."/>
             <wp:cNvGraphicFramePr>
               <a:graphicFrameLocks xmlns:a="http://schemas.openxmlformats.org/drawingml/2006/main" noChangeAspect="1"/>
             </wp:cNvGraphicFramePr>
@@ -5505,10 +5901,10 @@
           <w:noProof/>
         </w:rPr>
         <w:drawing>
-          <wp:inline distT="0" distB="0" distL="0" distR="0" wp14:anchorId="0FA362A8" wp14:editId="0A0C75B7">
+          <wp:inline distT="0" distB="0" distL="0" distR="0" wp14:anchorId="2FC24388" wp14:editId="4AA59086">
             <wp:extent cx="5715000" cy="3790950"/>
             <wp:effectExtent l="0" t="0" r="0" b="0"/>
-            <wp:docPr id="589069727" name="g1_12_portafolio_habilidades.png" descr="Habilidades agrupadas por área." title="Habilidades agrupadas por área."/>
+            <wp:docPr id="2144658071" name="g1_12_portafolio_habilidades.png" descr="Habilidades agrupadas por área." title="Habilidades agrupadas por área."/>
             <wp:cNvGraphicFramePr>
               <a:graphicFrameLocks xmlns:a="http://schemas.openxmlformats.org/drawingml/2006/main" noChangeAspect="1"/>
             </wp:cNvGraphicFramePr>
@@ -5581,10 +5977,10 @@
           <w:noProof/>
         </w:rPr>
         <w:drawing>
-          <wp:inline distT="0" distB="0" distL="0" distR="0" wp14:anchorId="1B0CA72E" wp14:editId="4F763DF1">
+          <wp:inline distT="0" distB="0" distL="0" distR="0" wp14:anchorId="4CA62F88" wp14:editId="1E7A5FDB">
             <wp:extent cx="5715000" cy="3790950"/>
             <wp:effectExtent l="0" t="0" r="0" b="0"/>
-            <wp:docPr id="60079361" name="g1_13_portafolio_proyectos.png" descr="Sección de proyectos." title="Sección de proyectos."/>
+            <wp:docPr id="1621195974" name="g1_13_portafolio_proyectos.png" descr="Sección de proyectos." title="Sección de proyectos."/>
             <wp:cNvGraphicFramePr>
               <a:graphicFrameLocks xmlns:a="http://schemas.openxmlformats.org/drawingml/2006/main" noChangeAspect="1"/>
             </wp:cNvGraphicFramePr>
@@ -5677,10 +6073,10 @@
           <w:noProof/>
         </w:rPr>
         <w:drawing>
-          <wp:inline distT="0" distB="0" distL="0" distR="0" wp14:anchorId="0633232A" wp14:editId="72D8C936">
+          <wp:inline distT="0" distB="0" distL="0" distR="0" wp14:anchorId="57BC1A2A" wp14:editId="6644B3A4">
             <wp:extent cx="5715000" cy="3790950"/>
             <wp:effectExtent l="0" t="0" r="0" b="0"/>
-            <wp:docPr id="1702213667" name="g1_14_portafolio_filtro_movil.png" descr="Filtro de proyectos con la categoría &quot;Móvil&quot; seleccionada." title="Filtro de proyectos con la categoría &quot;Móvil&quot; seleccionada."/>
+            <wp:docPr id="1644714967" name="g1_14_portafolio_filtro_movil.png" descr="Filtro de proyectos con la categoría &quot;Móvil&quot; seleccionada." title="Filtro de proyectos con la categoría &quot;Móvil&quot; seleccionada."/>
             <wp:cNvGraphicFramePr>
               <a:graphicFrameLocks xmlns:a="http://schemas.openxmlformats.org/drawingml/2006/main" noChangeAspect="1"/>
             </wp:cNvGraphicFramePr>
@@ -5753,10 +6149,10 @@
           <w:noProof/>
         </w:rPr>
         <w:drawing>
-          <wp:inline distT="0" distB="0" distL="0" distR="0" wp14:anchorId="01AC1D59" wp14:editId="42EE9535">
+          <wp:inline distT="0" distB="0" distL="0" distR="0" wp14:anchorId="74AC9A7A" wp14:editId="1CAF3CD9">
             <wp:extent cx="5715000" cy="3790950"/>
             <wp:effectExtent l="0" t="0" r="0" b="0"/>
-            <wp:docPr id="598215345" name="g1_15_portafolio_formacion.png" descr="Línea de tiempo de la formación académica." title="Línea de tiempo de la formación académica."/>
+            <wp:docPr id="1951454411" name="g1_15_portafolio_formacion.png" descr="Línea de tiempo de la formación académica." title="Línea de tiempo de la formación académica."/>
             <wp:cNvGraphicFramePr>
               <a:graphicFrameLocks xmlns:a="http://schemas.openxmlformats.org/drawingml/2006/main" noChangeAspect="1"/>
             </wp:cNvGraphicFramePr>
@@ -5829,10 +6225,10 @@
           <w:noProof/>
         </w:rPr>
         <w:drawing>
-          <wp:inline distT="0" distB="0" distL="0" distR="0" wp14:anchorId="55DEDCBC" wp14:editId="61C6F7E7">
+          <wp:inline distT="0" distB="0" distL="0" distR="0" wp14:anchorId="09BE147F" wp14:editId="5C25006F">
             <wp:extent cx="5715000" cy="3790950"/>
             <wp:effectExtent l="0" t="0" r="0" b="0"/>
-            <wp:docPr id="1279446642" name="g1_16_portafolio_contacto.png" descr="Sección de contacto." title="Sección de contacto."/>
+            <wp:docPr id="67290010" name="g1_16_portafolio_contacto.png" descr="Sección de contacto." title="Sección de contacto."/>
             <wp:cNvGraphicFramePr>
               <a:graphicFrameLocks xmlns:a="http://schemas.openxmlformats.org/drawingml/2006/main" noChangeAspect="1"/>
             </wp:cNvGraphicFramePr>
@@ -5949,10 +6345,10 @@
           <w:noProof/>
         </w:rPr>
         <w:drawing>
-          <wp:inline distT="0" distB="0" distL="0" distR="0" wp14:anchorId="2921506E" wp14:editId="7E175AEF">
+          <wp:inline distT="0" distB="0" distL="0" distR="0" wp14:anchorId="128E9A4A" wp14:editId="03C1B4F2">
             <wp:extent cx="5715000" cy="3790950"/>
             <wp:effectExtent l="0" t="0" r="0" b="0"/>
-            <wp:docPr id="524882812" name="g1_17_ruta_dinamica_enruta.png" descr="Página de detalle generada por la ruta dinámica /proyectos/[slug]." title="Página de detalle generada por la ruta dinámica /proyectos/[slug]."/>
+            <wp:docPr id="1374453430" name="g1_17_ruta_dinamica_enruta.png" descr="Página de detalle generada por la ruta dinámica /proyectos/[slug]." title="Página de detalle generada por la ruta dinámica /proyectos/[slug]."/>
             <wp:cNvGraphicFramePr>
               <a:graphicFrameLocks xmlns:a="http://schemas.openxmlformats.org/drawingml/2006/main" noChangeAspect="1"/>
             </wp:cNvGraphicFramePr>
@@ -6061,10 +6457,10 @@
                 <w:noProof/>
               </w:rPr>
               <w:drawing>
-                <wp:inline distT="0" distB="0" distL="0" distR="0" wp14:anchorId="61086DE5" wp14:editId="1B6CD9C3">
+                <wp:inline distT="0" distB="0" distL="0" distR="0" wp14:anchorId="394753E6" wp14:editId="006A69F0">
                   <wp:extent cx="2381250" cy="4057650"/>
                   <wp:effectExtent l="0" t="0" r="0" b="0"/>
-                  <wp:docPr id="270035378" name="g1_18_movil.png" descr="Vista en celular y menú de navegación móvil." title="Vista en celular y menú de navegación móvil."/>
+                  <wp:docPr id="551742970" name="g1_18_movil.png" descr="Vista en celular y menú de navegación móvil." title="Vista en celular y menú de navegación móvil."/>
                   <wp:cNvGraphicFramePr>
                     <a:graphicFrameLocks xmlns:a="http://schemas.openxmlformats.org/drawingml/2006/main" noChangeAspect="1"/>
                   </wp:cNvGraphicFramePr>
@@ -6120,10 +6516,10 @@
                 <w:noProof/>
               </w:rPr>
               <w:drawing>
-                <wp:inline distT="0" distB="0" distL="0" distR="0" wp14:anchorId="39EAD313" wp14:editId="00B05374">
+                <wp:inline distT="0" distB="0" distL="0" distR="0" wp14:anchorId="0D6EC554" wp14:editId="6D94D046">
                   <wp:extent cx="2381250" cy="4057650"/>
                   <wp:effectExtent l="0" t="0" r="0" b="0"/>
-                  <wp:docPr id="577395505" name="g1_19_movil_menu.png" descr="Vista en celular y menú de navegación móvil." title="Vista en celular y menú de navegación móvil."/>
+                  <wp:docPr id="2116867475" name="g1_19_movil_menu.png" descr="Vista en celular y menú de navegación móvil." title="Vista en celular y menú de navegación móvil."/>
                   <wp:cNvGraphicFramePr>
                     <a:graphicFrameLocks xmlns:a="http://schemas.openxmlformats.org/drawingml/2006/main" noChangeAspect="1"/>
                   </wp:cNvGraphicFramePr>
@@ -6192,7 +6588,7 @@
       <w:pPr>
         <w:pStyle w:val="Ttulo3"/>
       </w:pPr>
-      <w:bookmarkStart w:id="15" w:name="_Toc241059000"/>
+      <w:bookmarkStart w:id="15" w:name="_Toc241060426"/>
       <w:r>
         <w:t>Construcción para producción</w:t>
       </w:r>
@@ -6261,10 +6657,10 @@
           <w:noProof/>
         </w:rPr>
         <w:drawing>
-          <wp:inline distT="0" distB="0" distL="0" distR="0" wp14:anchorId="077E2A90" wp14:editId="0E338A3E">
+          <wp:inline distT="0" distB="0" distL="0" distR="0" wp14:anchorId="010711F2" wp14:editId="07481A34">
             <wp:extent cx="5334000" cy="4257675"/>
             <wp:effectExtent l="0" t="0" r="0" b="0"/>
-            <wp:docPr id="49064673" name="g1_21_npm_run_build.png" descr="Build de producción exitoso." title="Build de producción exitoso."/>
+            <wp:docPr id="1565994728" name="g1_21_npm_run_build.png" descr="Build de producción exitoso." title="Build de producción exitoso."/>
             <wp:cNvGraphicFramePr>
               <a:graphicFrameLocks xmlns:a="http://schemas.openxmlformats.org/drawingml/2006/main" noChangeAspect="1"/>
             </wp:cNvGraphicFramePr>
@@ -6331,7 +6727,7 @@
         <w:pStyle w:val="Ttulo1"/>
         <w:pageBreakBefore/>
       </w:pPr>
-      <w:bookmarkStart w:id="16" w:name="_Toc241059001"/>
+      <w:bookmarkStart w:id="16" w:name="_Toc241060427"/>
       <w:r>
         <w:t>Guía 2 – Despliegue de aplicaciones en Vercel</w:t>
       </w:r>
@@ -6344,7 +6740,7 @@
         <w:spacing w:before="320" w:after="200"/>
         <w:jc w:val="center"/>
       </w:pPr>
-      <w:bookmarkStart w:id="17" w:name="_Toc241059002"/>
+      <w:bookmarkStart w:id="17" w:name="_Toc241060428"/>
       <w:r>
         <w:rPr>
           <w:color w:val="FFFFFF"/>
@@ -6440,7 +6836,7 @@
         <w:spacing w:before="320" w:after="200"/>
         <w:jc w:val="center"/>
       </w:pPr>
-      <w:bookmarkStart w:id="18" w:name="_Toc241059003"/>
+      <w:bookmarkStart w:id="18" w:name="_Toc241060429"/>
       <w:r>
         <w:rPr>
           <w:color w:val="FFFFFF"/>
@@ -6455,7 +6851,7 @@
       <w:pPr>
         <w:pStyle w:val="Ttulo3"/>
       </w:pPr>
-      <w:bookmarkStart w:id="19" w:name="_Toc241059004"/>
+      <w:bookmarkStart w:id="19" w:name="_Toc241060430"/>
       <w:r>
         <w:t>1. Requisitos</w:t>
       </w:r>
@@ -6503,7 +6899,7 @@
       <w:pPr>
         <w:pStyle w:val="Ttulo3"/>
       </w:pPr>
-      <w:bookmarkStart w:id="20" w:name="_Toc241059005"/>
+      <w:bookmarkStart w:id="20" w:name="_Toc241060431"/>
       <w:r>
         <w:t>2. Repositorio en GitHub</w:t>
       </w:r>
@@ -6538,10 +6934,10 @@
           <w:noProof/>
         </w:rPr>
         <w:drawing>
-          <wp:inline distT="0" distB="0" distL="0" distR="0" wp14:anchorId="6A4B26C7" wp14:editId="601B95F7">
+          <wp:inline distT="0" distB="0" distL="0" distR="0" wp14:anchorId="7421F396" wp14:editId="558ABDC3">
             <wp:extent cx="5715000" cy="3219450"/>
             <wp:effectExtent l="0" t="0" r="0" b="0"/>
-            <wp:docPr id="763767864" name="g2_04_repo_vacio.png" descr="Repositorio modulo239 vacío, antes de subir el proyecto." title="Repositorio modulo239 vacío, antes de subir el proyecto."/>
+            <wp:docPr id="931508278" name="g2_04_repo_vacio.png" descr="Repositorio modulo239 vacío, antes de subir el proyecto." title="Repositorio modulo239 vacío, antes de subir el proyecto."/>
             <wp:cNvGraphicFramePr>
               <a:graphicFrameLocks xmlns:a="http://schemas.openxmlformats.org/drawingml/2006/main" noChangeAspect="1"/>
             </wp:cNvGraphicFramePr>
@@ -6607,7 +7003,7 @@
       <w:pPr>
         <w:pStyle w:val="Ttulo3"/>
       </w:pPr>
-      <w:bookmarkStart w:id="21" w:name="_Toc241059006"/>
+      <w:bookmarkStart w:id="21" w:name="_Toc241060432"/>
       <w:r>
         <w:t>3. Subida del proyecto con Git Bash</w:t>
       </w:r>
@@ -6839,10 +7235,10 @@
           <w:noProof/>
         </w:rPr>
         <w:drawing>
-          <wp:inline distT="0" distB="0" distL="0" distR="0" wp14:anchorId="1D551C05" wp14:editId="6520A5E2">
+          <wp:inline distT="0" distB="0" distL="0" distR="0" wp14:anchorId="469EB23D" wp14:editId="5128A42D">
             <wp:extent cx="5334000" cy="4152900"/>
             <wp:effectExtent l="0" t="0" r="0" b="0"/>
-            <wp:docPr id="220884083" name="g2_05_gitbash_status.png" descr="git init, git remote add y git status." title="git init, git remote add y git status."/>
+            <wp:docPr id="618688066" name="g2_05_gitbash_status.png" descr="git init, git remote add y git status." title="git init, git remote add y git status."/>
             <wp:cNvGraphicFramePr>
               <a:graphicFrameLocks xmlns:a="http://schemas.openxmlformats.org/drawingml/2006/main" noChangeAspect="1"/>
             </wp:cNvGraphicFramePr>
@@ -6993,10 +7389,10 @@
           <w:noProof/>
         </w:rPr>
         <w:drawing>
-          <wp:inline distT="0" distB="0" distL="0" distR="0" wp14:anchorId="3088C68A" wp14:editId="0A356424">
+          <wp:inline distT="0" distB="0" distL="0" distR="0" wp14:anchorId="1F2F4045" wp14:editId="72C15C72">
             <wp:extent cx="5334000" cy="4152900"/>
             <wp:effectExtent l="0" t="0" r="0" b="0"/>
-            <wp:docPr id="1610376546" name="g2_06_gitbash_push.png" descr="git add, git commit, git branch -M main y git push." title="git add, git commit, git branch -M main y git push."/>
+            <wp:docPr id="1586182661" name="g2_06_gitbash_push.png" descr="git add, git commit, git branch -M main y git push." title="git add, git commit, git branch -M main y git push."/>
             <wp:cNvGraphicFramePr>
               <a:graphicFrameLocks xmlns:a="http://schemas.openxmlformats.org/drawingml/2006/main" noChangeAspect="1"/>
             </wp:cNvGraphicFramePr>
@@ -7062,7 +7458,7 @@
       <w:pPr>
         <w:pStyle w:val="Ttulo3"/>
       </w:pPr>
-      <w:bookmarkStart w:id="22" w:name="_Toc241059007"/>
+      <w:bookmarkStart w:id="22" w:name="_Toc241060433"/>
       <w:r>
         <w:t>4. Verificación en GitHub</w:t>
       </w:r>
@@ -7135,10 +7531,10 @@
           <w:noProof/>
         </w:rPr>
         <w:drawing>
-          <wp:inline distT="0" distB="0" distL="0" distR="0" wp14:anchorId="3D4F81E9" wp14:editId="2E379067">
+          <wp:inline distT="0" distB="0" distL="0" distR="0" wp14:anchorId="7F048941" wp14:editId="6C128EF4">
             <wp:extent cx="5715000" cy="3981450"/>
             <wp:effectExtent l="0" t="0" r="0" b="0"/>
-            <wp:docPr id="1377478107" name="g2_07_github_repo_subido.png" descr="Proyecto subido al repositorio modulo239." title="Proyecto subido al repositorio modulo239."/>
+            <wp:docPr id="1289458726" name="g2_07_github_repo_subido.png" descr="Proyecto subido al repositorio modulo239." title="Proyecto subido al repositorio modulo239."/>
             <wp:cNvGraphicFramePr>
               <a:graphicFrameLocks xmlns:a="http://schemas.openxmlformats.org/drawingml/2006/main" noChangeAspect="1"/>
             </wp:cNvGraphicFramePr>
@@ -7204,9 +7600,9 @@
       <w:pPr>
         <w:pStyle w:val="Ttulo3"/>
       </w:pPr>
-      <w:bookmarkStart w:id="23" w:name="_Toc241059008"/>
-      <w:r>
-        <w:t>5. Despliegue en Vercel (pendiente)</w:t>
+      <w:bookmarkStart w:id="23" w:name="_Toc241060434"/>
+      <w:r>
+        <w:t>5. Cuenta de Vercel e importación del repositorio</w:t>
       </w:r>
       <w:bookmarkEnd w:id="23"/>
     </w:p>
@@ -7215,17 +7611,85 @@
         <w:spacing w:after="120" w:line="288" w:lineRule="auto"/>
       </w:pPr>
       <w:r>
-        <w:t xml:space="preserve">Esta parte de la guía queda </w:t>
+        <w:t xml:space="preserve">Se ingresó a https://vercel.com y se inició sesión con </w:t>
       </w:r>
       <w:r>
         <w:rPr>
           <w:b/>
           <w:bCs/>
         </w:rPr>
-        <w:t>pendiente</w:t>
-      </w:r>
-      <w:r>
-        <w:t>: requiere iniciar sesión en Vercel con la cuenta de GitHub del estudiante y autorizar a Vercel el acceso al repositorio. El proyecto ya está listo para desplegarse: el build de producción (</w:t>
+        <w:t>Continue with GitHub</w:t>
+      </w:r>
+      <w:r>
+        <w:t xml:space="preserve">, usando la cuenta Cdanielnam. Se eligió el plan </w:t>
+      </w:r>
+      <w:r>
+        <w:rPr>
+          <w:b/>
+          <w:bCs/>
+        </w:rPr>
+        <w:t>Hobby</w:t>
+      </w:r>
+      <w:r>
+        <w:t xml:space="preserve"> (gratuito, para proyectos personales), con el equipo </w:t>
+      </w:r>
+      <w:r>
+        <w:rPr>
+          <w:b/>
+          <w:bCs/>
+        </w:rPr>
+        <w:t>cdanielnam's projects</w:t>
+      </w:r>
+      <w:r>
+        <w:t>.</w:t>
+      </w:r>
+    </w:p>
+    <w:p>
+      <w:pPr>
+        <w:spacing w:after="120" w:line="288" w:lineRule="auto"/>
+      </w:pPr>
+      <w:r>
+        <w:t xml:space="preserve">En </w:t>
+      </w:r>
+      <w:r>
+        <w:rPr>
+          <w:b/>
+          <w:bCs/>
+        </w:rPr>
+        <w:t>Import Git Repository</w:t>
+      </w:r>
+      <w:r>
+        <w:t xml:space="preserve"> se autorizó a Vercel el acceso al repositorio </w:t>
+      </w:r>
+      <w:r>
+        <w:rPr>
+          <w:b/>
+          <w:bCs/>
+        </w:rPr>
+        <w:t>modulo239</w:t>
+      </w:r>
+      <w:r>
+        <w:t xml:space="preserve"> y se pulsó </w:t>
+      </w:r>
+      <w:r>
+        <w:rPr>
+          <w:b/>
+          <w:bCs/>
+        </w:rPr>
+        <w:t>Import</w:t>
+      </w:r>
+      <w:r>
+        <w:t xml:space="preserve">. Vercel detectó el preset </w:t>
+      </w:r>
+      <w:r>
+        <w:rPr>
+          <w:b/>
+          <w:bCs/>
+        </w:rPr>
+        <w:t>Next.js</w:t>
+      </w:r>
+      <w:r>
+        <w:t xml:space="preserve"> y el directorio raíz </w:t>
       </w:r>
       <w:r>
         <w:rPr>
@@ -7234,18 +7698,84 @@
           <w:sz w:val="19"/>
           <w:szCs w:val="19"/>
         </w:rPr>
+        <w:t>./</w:t>
+      </w:r>
+      <w:r>
+        <w:t xml:space="preserve">, así que no fue necesario cambiar la configuración de build ni agregar variables de entorno antes de pulsar </w:t>
+      </w:r>
+      <w:r>
+        <w:rPr>
+          <w:b/>
+          <w:bCs/>
+        </w:rPr>
+        <w:t>Deploy</w:t>
+      </w:r>
+      <w:r>
+        <w:t>.</w:t>
+      </w:r>
+    </w:p>
+    <w:p>
+      <w:pPr>
+        <w:pStyle w:val="Ttulo3"/>
+      </w:pPr>
+      <w:bookmarkStart w:id="24" w:name="_Toc241060435"/>
+      <w:r>
+        <w:t>6. Primer despliegue</w:t>
+      </w:r>
+      <w:bookmarkEnd w:id="24"/>
+    </w:p>
+    <w:p>
+      <w:pPr>
+        <w:spacing w:after="120" w:line="288" w:lineRule="auto"/>
+      </w:pPr>
+      <w:r>
+        <w:t xml:space="preserve">Vercel descargó el código de la rama </w:t>
+      </w:r>
+      <w:r>
+        <w:rPr>
+          <w:rFonts w:ascii="Consolas" w:eastAsia="Consolas" w:hAnsi="Consolas" w:cs="Consolas"/>
+          <w:color w:val="C7254E"/>
+          <w:sz w:val="19"/>
+          <w:szCs w:val="19"/>
+        </w:rPr>
+        <w:t>main</w:t>
+      </w:r>
+      <w:r>
+        <w:t xml:space="preserve">, ejecutó </w:t>
+      </w:r>
+      <w:r>
+        <w:rPr>
+          <w:rFonts w:ascii="Consolas" w:eastAsia="Consolas" w:hAnsi="Consolas" w:cs="Consolas"/>
+          <w:color w:val="C7254E"/>
+          <w:sz w:val="19"/>
+          <w:szCs w:val="19"/>
+        </w:rPr>
+        <w:t>npm install</w:t>
+      </w:r>
+      <w:r>
+        <w:t xml:space="preserve"> y </w:t>
+      </w:r>
+      <w:r>
+        <w:rPr>
+          <w:rFonts w:ascii="Consolas" w:eastAsia="Consolas" w:hAnsi="Consolas" w:cs="Consolas"/>
+          <w:color w:val="C7254E"/>
+          <w:sz w:val="19"/>
+          <w:szCs w:val="19"/>
+        </w:rPr>
         <w:t>npm run build</w:t>
       </w:r>
       <w:r>
-        <w:t>), que es el mismo proceso que ejecuta Vercel, terminó sin errores en la Guía 1.</w:t>
-      </w:r>
-    </w:p>
-    <w:p>
-      <w:pPr>
-        <w:spacing w:after="120" w:line="288" w:lineRule="auto"/>
-      </w:pPr>
-      <w:r>
-        <w:t>Pasos que faltan:</w:t>
+        <w:t xml:space="preserve"> y publicó el resultado. Al terminar, el panel </w:t>
+      </w:r>
+      <w:r>
+        <w:rPr>
+          <w:b/>
+          <w:bCs/>
+        </w:rPr>
+        <w:t>Overview</w:t>
+      </w:r>
+      <w:r>
+        <w:t xml:space="preserve"> del proyecto muestra el despliegue de producción:</w:t>
       </w:r>
     </w:p>
     <w:p>
@@ -7258,27 +7788,26 @@
         <w:spacing w:after="60" w:line="276" w:lineRule="auto"/>
       </w:pPr>
       <w:r>
-        <w:t xml:space="preserve">Ingresar a https://vercel.com, elegir </w:t>
-      </w:r>
-      <w:r>
         <w:rPr>
           <w:b/>
           <w:bCs/>
         </w:rPr>
-        <w:t>Continue with GitHub</w:t>
-      </w:r>
-      <w:r>
-        <w:t xml:space="preserve"> y el plan </w:t>
-      </w:r>
-      <w:r>
-        <w:rPr>
-          <w:b/>
-          <w:bCs/>
-        </w:rPr>
-        <w:t>Hobby</w:t>
-      </w:r>
-      <w:r>
-        <w:t>.</w:t>
+        <w:t>Deployment:</w:t>
+      </w:r>
+      <w:r>
+        <w:t xml:space="preserve"> </w:t>
+      </w:r>
+      <w:r>
+        <w:rPr>
+          <w:rFonts w:ascii="Consolas" w:eastAsia="Consolas" w:hAnsi="Consolas" w:cs="Consolas"/>
+          <w:color w:val="C7254E"/>
+          <w:sz w:val="19"/>
+          <w:szCs w:val="19"/>
+        </w:rPr>
+        <w:t>modulo239-jkegc1up4-cdanielnam.vercel.app</w:t>
+      </w:r>
+      <w:r>
+        <w:t>, la URL única de esta versión.</w:t>
       </w:r>
     </w:p>
     <w:p>
@@ -7291,37 +7820,26 @@
         <w:spacing w:after="60" w:line="276" w:lineRule="auto"/>
       </w:pPr>
       <w:r>
-        <w:t xml:space="preserve">En </w:t>
-      </w:r>
-      <w:r>
         <w:rPr>
           <w:b/>
           <w:bCs/>
         </w:rPr>
-        <w:t>Import Git Repository</w:t>
-      </w:r>
-      <w:r>
-        <w:t xml:space="preserve">, dar acceso al repositorio </w:t>
-      </w:r>
-      <w:r>
-        <w:rPr>
-          <w:b/>
-          <w:bCs/>
-        </w:rPr>
-        <w:t>modulo239</w:t>
-      </w:r>
-      <w:r>
-        <w:t xml:space="preserve"> y pulsar </w:t>
-      </w:r>
-      <w:r>
-        <w:rPr>
-          <w:b/>
-          <w:bCs/>
-        </w:rPr>
-        <w:t>Import</w:t>
-      </w:r>
-      <w:r>
-        <w:t>.</w:t>
+        <w:t>Domains:</w:t>
+      </w:r>
+      <w:r>
+        <w:t xml:space="preserve"> </w:t>
+      </w:r>
+      <w:r>
+        <w:rPr>
+          <w:rFonts w:ascii="Consolas" w:eastAsia="Consolas" w:hAnsi="Consolas" w:cs="Consolas"/>
+          <w:color w:val="C7254E"/>
+          <w:sz w:val="19"/>
+          <w:szCs w:val="19"/>
+        </w:rPr>
+        <w:t>modulo239.vercel.app</w:t>
+      </w:r>
+      <w:r>
+        <w:t>, el dominio público que siempre apunta a la versión de producción más reciente.</w:t>
       </w:r>
     </w:p>
     <w:p>
@@ -7334,39 +7852,14 @@
         <w:spacing w:after="60" w:line="276" w:lineRule="auto"/>
       </w:pPr>
       <w:r>
-        <w:t xml:space="preserve">Verificar que el preset sea </w:t>
-      </w:r>
-      <w:r>
         <w:rPr>
           <w:b/>
           <w:bCs/>
         </w:rPr>
-        <w:t>Next.js</w:t>
-      </w:r>
-      <w:r>
-        <w:t xml:space="preserve"> y el directorio raíz </w:t>
-      </w:r>
-      <w:r>
-        <w:rPr>
-          <w:rFonts w:ascii="Consolas" w:eastAsia="Consolas" w:hAnsi="Consolas" w:cs="Consolas"/>
-          <w:color w:val="C7254E"/>
-          <w:sz w:val="19"/>
-          <w:szCs w:val="19"/>
-        </w:rPr>
-        <w:t>./</w:t>
-      </w:r>
-      <w:r>
-        <w:t xml:space="preserve">, y pulsar </w:t>
-      </w:r>
-      <w:r>
-        <w:rPr>
-          <w:b/>
-          <w:bCs/>
-        </w:rPr>
-        <w:t>Deploy</w:t>
-      </w:r>
-      <w:r>
-        <w:t>.</w:t>
+        <w:t>Status:</w:t>
+      </w:r>
+      <w:r>
+        <w:t xml:space="preserve"> Ready.</w:t>
       </w:r>
     </w:p>
     <w:p>
@@ -7379,7 +7872,14 @@
         <w:spacing w:after="60" w:line="276" w:lineRule="auto"/>
       </w:pPr>
       <w:r>
-        <w:t xml:space="preserve">Al terminar el build, abrir el dominio </w:t>
+        <w:rPr>
+          <w:b/>
+          <w:bCs/>
+        </w:rPr>
+        <w:t>Source:</w:t>
+      </w:r>
+      <w:r>
+        <w:t xml:space="preserve"> rama </w:t>
       </w:r>
       <w:r>
         <w:rPr>
@@ -7388,21 +7888,918 @@
           <w:sz w:val="19"/>
           <w:szCs w:val="19"/>
         </w:rPr>
-        <w:t>.vercel.app</w:t>
-      </w:r>
-      <w:r>
-        <w:t xml:space="preserve"> asignado desde </w:t>
-      </w:r>
+        <w:t>main</w:t>
+      </w:r>
+      <w:r>
+        <w:t xml:space="preserve">, commit </w:t>
+      </w:r>
+      <w:r>
+        <w:rPr>
+          <w:rFonts w:ascii="Consolas" w:eastAsia="Consolas" w:hAnsi="Consolas" w:cs="Consolas"/>
+          <w:color w:val="C7254E"/>
+          <w:sz w:val="19"/>
+          <w:szCs w:val="19"/>
+        </w:rPr>
+        <w:t>522b075</w:t>
+      </w:r>
+      <w:r>
+        <w:t>.</w:t>
+      </w:r>
+    </w:p>
+    <w:p>
+      <w:pPr>
+        <w:keepNext/>
+        <w:spacing w:before="120" w:after="60"/>
+        <w:jc w:val="center"/>
+      </w:pPr>
+      <w:r>
+        <w:rPr>
+          <w:noProof/>
+        </w:rPr>
+        <w:drawing>
+          <wp:inline distT="0" distB="0" distL="0" distR="0" wp14:anchorId="1F0308B9" wp14:editId="52727234">
+            <wp:extent cx="5715000" cy="2752725"/>
+            <wp:effectExtent l="0" t="0" r="0" b="0"/>
+            <wp:docPr id="1023525854" name="g2_10_vercel_dashboard.png" descr="Panel del proyecto modulo239 en Vercel con el primer despliegue en estado Ready." title="Panel del proyecto modulo239 en Vercel con el primer despliegue en estado Ready."/>
+            <wp:cNvGraphicFramePr>
+              <a:graphicFrameLocks xmlns:a="http://schemas.openxmlformats.org/drawingml/2006/main" noChangeAspect="1"/>
+            </wp:cNvGraphicFramePr>
+            <a:graphic xmlns:a="http://schemas.openxmlformats.org/drawingml/2006/main">
+              <a:graphicData uri="http://schemas.openxmlformats.org/drawingml/2006/picture">
+                <pic:pic xmlns:pic="http://schemas.openxmlformats.org/drawingml/2006/picture">
+                  <pic:nvPicPr>
+                    <pic:cNvPr id="0" name=""/>
+                    <pic:cNvPicPr>
+                      <a:picLocks noChangeAspect="1" noChangeArrowheads="1"/>
+                    </pic:cNvPicPr>
+                  </pic:nvPicPr>
+                  <pic:blipFill>
+                    <a:blip r:embed="rId32"/>
+                    <a:srcRect/>
+                    <a:stretch>
+                      <a:fillRect/>
+                    </a:stretch>
+                  </pic:blipFill>
+                  <pic:spPr bwMode="auto">
+                    <a:xfrm>
+                      <a:off x="0" y="0"/>
+                      <a:ext cx="5715000" cy="2752725"/>
+                    </a:xfrm>
+                    <a:prstGeom prst="rect">
+                      <a:avLst/>
+                    </a:prstGeom>
+                  </pic:spPr>
+                </pic:pic>
+              </a:graphicData>
+            </a:graphic>
+          </wp:inline>
+        </w:drawing>
+      </w:r>
+    </w:p>
+    <w:p>
+      <w:pPr>
+        <w:spacing w:after="240"/>
+        <w:jc w:val="center"/>
+      </w:pPr>
       <w:r>
         <w:rPr>
           <w:b/>
           <w:bCs/>
+          <w:color w:val="595959"/>
+          <w:sz w:val="18"/>
+          <w:szCs w:val="18"/>
+        </w:rPr>
+        <w:t xml:space="preserve">Figura 24. </w:t>
+      </w:r>
+      <w:r>
+        <w:rPr>
+          <w:i/>
+          <w:iCs/>
+          <w:color w:val="595959"/>
+          <w:sz w:val="18"/>
+          <w:szCs w:val="18"/>
+        </w:rPr>
+        <w:t>Panel del proyecto modulo239 en Vercel con el primer despliegue en estado Ready.</w:t>
+      </w:r>
+    </w:p>
+    <w:p>
+      <w:pPr>
+        <w:pStyle w:val="Ttulo3"/>
+      </w:pPr>
+      <w:bookmarkStart w:id="25" w:name="_Toc241060436"/>
+      <w:r>
+        <w:t>7. Sitio en producción</w:t>
+      </w:r>
+      <w:bookmarkEnd w:id="25"/>
+    </w:p>
+    <w:p>
+      <w:pPr>
+        <w:spacing w:after="120" w:line="288" w:lineRule="auto"/>
+      </w:pPr>
+      <w:r>
+        <w:t xml:space="preserve">Desde </w:t>
+      </w:r>
+      <w:r>
+        <w:rPr>
+          <w:b/>
+          <w:bCs/>
         </w:rPr>
         <w:t>Domains</w:t>
       </w:r>
       <w:r>
-        <w:t>.</w:t>
-      </w:r>
+        <w:t xml:space="preserve"> se abrió el enlace del sitio. El portafolio quedó disponible en Internet en </w:t>
+      </w:r>
+      <w:r>
+        <w:rPr>
+          <w:b/>
+          <w:bCs/>
+        </w:rPr>
+        <w:t>https://modulo239.vercel.app</w:t>
+      </w:r>
+      <w:r>
+        <w:t>, con las mismas páginas que se probaron en local, incluidas las 9 páginas de proyectos.</w:t>
+      </w:r>
+    </w:p>
+    <w:p>
+      <w:pPr>
+        <w:keepNext/>
+        <w:spacing w:before="120" w:after="60"/>
+        <w:jc w:val="center"/>
+      </w:pPr>
+      <w:r>
+        <w:rPr>
+          <w:noProof/>
+        </w:rPr>
+        <w:drawing>
+          <wp:inline distT="0" distB="0" distL="0" distR="0" wp14:anchorId="0B941C4C" wp14:editId="4C0E3632">
+            <wp:extent cx="5715000" cy="3790950"/>
+            <wp:effectExtent l="0" t="0" r="0" b="0"/>
+            <wp:docPr id="971995797" name="g2_11_sitio_publicado.png" descr="Portafolio publicado en https://modulo239.vercel.app." title="Portafolio publicado en https://modulo239.vercel.app."/>
+            <wp:cNvGraphicFramePr>
+              <a:graphicFrameLocks xmlns:a="http://schemas.openxmlformats.org/drawingml/2006/main" noChangeAspect="1"/>
+            </wp:cNvGraphicFramePr>
+            <a:graphic xmlns:a="http://schemas.openxmlformats.org/drawingml/2006/main">
+              <a:graphicData uri="http://schemas.openxmlformats.org/drawingml/2006/picture">
+                <pic:pic xmlns:pic="http://schemas.openxmlformats.org/drawingml/2006/picture">
+                  <pic:nvPicPr>
+                    <pic:cNvPr id="0" name=""/>
+                    <pic:cNvPicPr>
+                      <a:picLocks noChangeAspect="1" noChangeArrowheads="1"/>
+                    </pic:cNvPicPr>
+                  </pic:nvPicPr>
+                  <pic:blipFill>
+                    <a:blip r:embed="rId33"/>
+                    <a:srcRect/>
+                    <a:stretch>
+                      <a:fillRect/>
+                    </a:stretch>
+                  </pic:blipFill>
+                  <pic:spPr bwMode="auto">
+                    <a:xfrm>
+                      <a:off x="0" y="0"/>
+                      <a:ext cx="5715000" cy="3790950"/>
+                    </a:xfrm>
+                    <a:prstGeom prst="rect">
+                      <a:avLst/>
+                    </a:prstGeom>
+                  </pic:spPr>
+                </pic:pic>
+              </a:graphicData>
+            </a:graphic>
+          </wp:inline>
+        </w:drawing>
+      </w:r>
+    </w:p>
+    <w:p>
+      <w:pPr>
+        <w:spacing w:after="240"/>
+        <w:jc w:val="center"/>
+      </w:pPr>
+      <w:r>
+        <w:rPr>
+          <w:b/>
+          <w:bCs/>
+          <w:color w:val="595959"/>
+          <w:sz w:val="18"/>
+          <w:szCs w:val="18"/>
+        </w:rPr>
+        <w:t xml:space="preserve">Figura 25. </w:t>
+      </w:r>
+      <w:r>
+        <w:rPr>
+          <w:i/>
+          <w:iCs/>
+          <w:color w:val="595959"/>
+          <w:sz w:val="18"/>
+          <w:szCs w:val="18"/>
+        </w:rPr>
+        <w:t>Portafolio publicado en https://modulo239.vercel.app.</w:t>
+      </w:r>
+    </w:p>
+    <w:p>
+      <w:pPr>
+        <w:pStyle w:val="Ttulo3"/>
+      </w:pPr>
+      <w:bookmarkStart w:id="26" w:name="_Toc241060437"/>
+      <w:r>
+        <w:t>8. Actualización mediante un nuevo despliegue</w:t>
+      </w:r>
+      <w:bookmarkEnd w:id="26"/>
+    </w:p>
+    <w:p>
+      <w:pPr>
+        <w:spacing w:after="120" w:line="288" w:lineRule="auto"/>
+      </w:pPr>
+      <w:r>
+        <w:t xml:space="preserve">Para comprobar el despliegue automático se hizo un cambio en el código: el proyecto CesarPortafolio ahora enlaza al sitio publicado, con el botón </w:t>
+      </w:r>
+      <w:r>
+        <w:rPr>
+          <w:b/>
+          <w:bCs/>
+        </w:rPr>
+        <w:t>Ver sitio publicado</w:t>
+      </w:r>
+      <w:r>
+        <w:t xml:space="preserve"> en su página de detalle y la etiqueta </w:t>
+      </w:r>
+      <w:r>
+        <w:rPr>
+          <w:b/>
+          <w:bCs/>
+        </w:rPr>
+        <w:t>En vivo</w:t>
+      </w:r>
+      <w:r>
+        <w:t xml:space="preserve"> en su tarjeta. También se agregó la URL al README y como </w:t>
+      </w:r>
+      <w:r>
+        <w:rPr>
+          <w:rFonts w:ascii="Consolas" w:eastAsia="Consolas" w:hAnsi="Consolas" w:cs="Consolas"/>
+          <w:color w:val="C7254E"/>
+          <w:sz w:val="19"/>
+          <w:szCs w:val="19"/>
+        </w:rPr>
+        <w:t>metadataBase</w:t>
+      </w:r>
+      <w:r>
+        <w:t xml:space="preserve"> en los metadatos del sitio. Después se siguió el mismo flujo de la guía:</w:t>
+      </w:r>
+    </w:p>
+    <w:p>
+      <w:pPr>
+        <w:keepNext/>
+        <w:keepLines/>
+        <w:pBdr>
+          <w:left w:val="single" w:sz="12" w:space="6" w:color="31849B"/>
+        </w:pBdr>
+        <w:shd w:val="clear" w:color="auto" w:fill="F2F2F2"/>
+        <w:spacing w:before="60"/>
+        <w:ind w:left="180"/>
+      </w:pPr>
+      <w:r>
+        <w:rPr>
+          <w:rFonts w:ascii="Consolas" w:eastAsia="Consolas" w:hAnsi="Consolas" w:cs="Consolas"/>
+          <w:color w:val="1F1F1F"/>
+          <w:sz w:val="18"/>
+          <w:szCs w:val="18"/>
+        </w:rPr>
+        <w:t>Código modificado</w:t>
+      </w:r>
+    </w:p>
+    <w:p>
+      <w:pPr>
+        <w:keepNext/>
+        <w:keepLines/>
+        <w:pBdr>
+          <w:left w:val="single" w:sz="12" w:space="6" w:color="31849B"/>
+        </w:pBdr>
+        <w:shd w:val="clear" w:color="auto" w:fill="F2F2F2"/>
+        <w:ind w:left="180"/>
+      </w:pPr>
+      <w:r>
+        <w:rPr>
+          <w:rFonts w:ascii="Consolas" w:eastAsia="Consolas" w:hAnsi="Consolas" w:cs="Consolas"/>
+          <w:color w:val="1F1F1F"/>
+          <w:sz w:val="18"/>
+          <w:szCs w:val="18"/>
+        </w:rPr>
+        <w:t xml:space="preserve">  → git add .</w:t>
+      </w:r>
+    </w:p>
+    <w:p>
+      <w:pPr>
+        <w:keepNext/>
+        <w:keepLines/>
+        <w:pBdr>
+          <w:left w:val="single" w:sz="12" w:space="6" w:color="31849B"/>
+        </w:pBdr>
+        <w:shd w:val="clear" w:color="auto" w:fill="F2F2F2"/>
+        <w:ind w:left="180"/>
+      </w:pPr>
+      <w:r>
+        <w:rPr>
+          <w:rFonts w:ascii="Consolas" w:eastAsia="Consolas" w:hAnsi="Consolas" w:cs="Consolas"/>
+          <w:color w:val="1F1F1F"/>
+          <w:sz w:val="18"/>
+          <w:szCs w:val="18"/>
+        </w:rPr>
+        <w:t xml:space="preserve">  → git commit -m "Enlazar el portafolio con el sitio publicado en Vercel"</w:t>
+      </w:r>
+    </w:p>
+    <w:p>
+      <w:pPr>
+        <w:keepNext/>
+        <w:keepLines/>
+        <w:pBdr>
+          <w:left w:val="single" w:sz="12" w:space="6" w:color="31849B"/>
+        </w:pBdr>
+        <w:shd w:val="clear" w:color="auto" w:fill="F2F2F2"/>
+        <w:ind w:left="180"/>
+      </w:pPr>
+      <w:r>
+        <w:rPr>
+          <w:rFonts w:ascii="Consolas" w:eastAsia="Consolas" w:hAnsi="Consolas" w:cs="Consolas"/>
+          <w:color w:val="1F1F1F"/>
+          <w:sz w:val="18"/>
+          <w:szCs w:val="18"/>
+        </w:rPr>
+        <w:t xml:space="preserve">  → git push</w:t>
+      </w:r>
+    </w:p>
+    <w:p>
+      <w:pPr>
+        <w:keepLines/>
+        <w:pBdr>
+          <w:left w:val="single" w:sz="12" w:space="6" w:color="31849B"/>
+        </w:pBdr>
+        <w:shd w:val="clear" w:color="auto" w:fill="F2F2F2"/>
+        <w:spacing w:after="160"/>
+        <w:ind w:left="180"/>
+      </w:pPr>
+      <w:r>
+        <w:rPr>
+          <w:rFonts w:ascii="Consolas" w:eastAsia="Consolas" w:hAnsi="Consolas" w:cs="Consolas"/>
+          <w:color w:val="1F1F1F"/>
+          <w:sz w:val="18"/>
+          <w:szCs w:val="18"/>
+        </w:rPr>
+        <w:t xml:space="preserve">  → GitHub → Vercel detecta cambios → Nuevo build → Nuevo deployment</w:t>
+      </w:r>
+    </w:p>
+    <w:p>
+      <w:pPr>
+        <w:keepNext/>
+        <w:spacing w:before="120" w:after="60"/>
+        <w:jc w:val="center"/>
+      </w:pPr>
+      <w:r>
+        <w:rPr>
+          <w:noProof/>
+        </w:rPr>
+        <w:drawing>
+          <wp:inline distT="0" distB="0" distL="0" distR="0" wp14:anchorId="58420AE8" wp14:editId="78A951F3">
+            <wp:extent cx="5715000" cy="3152775"/>
+            <wp:effectExtent l="0" t="0" r="0" b="0"/>
+            <wp:docPr id="374138026" name="g2_12_gitbash_push_actualizacion.png" descr="Commit y push del cambio desde Git Bash." title="Commit y push del cambio desde Git Bash."/>
+            <wp:cNvGraphicFramePr>
+              <a:graphicFrameLocks xmlns:a="http://schemas.openxmlformats.org/drawingml/2006/main" noChangeAspect="1"/>
+            </wp:cNvGraphicFramePr>
+            <a:graphic xmlns:a="http://schemas.openxmlformats.org/drawingml/2006/main">
+              <a:graphicData uri="http://schemas.openxmlformats.org/drawingml/2006/picture">
+                <pic:pic xmlns:pic="http://schemas.openxmlformats.org/drawingml/2006/picture">
+                  <pic:nvPicPr>
+                    <pic:cNvPr id="0" name=""/>
+                    <pic:cNvPicPr>
+                      <a:picLocks noChangeAspect="1" noChangeArrowheads="1"/>
+                    </pic:cNvPicPr>
+                  </pic:nvPicPr>
+                  <pic:blipFill>
+                    <a:blip r:embed="rId34"/>
+                    <a:srcRect/>
+                    <a:stretch>
+                      <a:fillRect/>
+                    </a:stretch>
+                  </pic:blipFill>
+                  <pic:spPr bwMode="auto">
+                    <a:xfrm>
+                      <a:off x="0" y="0"/>
+                      <a:ext cx="5715000" cy="3152775"/>
+                    </a:xfrm>
+                    <a:prstGeom prst="rect">
+                      <a:avLst/>
+                    </a:prstGeom>
+                  </pic:spPr>
+                </pic:pic>
+              </a:graphicData>
+            </a:graphic>
+          </wp:inline>
+        </w:drawing>
+      </w:r>
+    </w:p>
+    <w:p>
+      <w:pPr>
+        <w:spacing w:after="240"/>
+        <w:jc w:val="center"/>
+      </w:pPr>
+      <w:r>
+        <w:rPr>
+          <w:b/>
+          <w:bCs/>
+          <w:color w:val="595959"/>
+          <w:sz w:val="18"/>
+          <w:szCs w:val="18"/>
+        </w:rPr>
+        <w:t xml:space="preserve">Figura 26. </w:t>
+      </w:r>
+      <w:r>
+        <w:rPr>
+          <w:i/>
+          <w:iCs/>
+          <w:color w:val="595959"/>
+          <w:sz w:val="18"/>
+          <w:szCs w:val="18"/>
+        </w:rPr>
+        <w:t>Commit y push del cambio desde Git Bash.</w:t>
+      </w:r>
+    </w:p>
+    <w:p>
+      <w:pPr>
+        <w:spacing w:after="120" w:line="288" w:lineRule="auto"/>
+      </w:pPr>
+      <w:r>
+        <w:t xml:space="preserve">Sin hacer nada más en Vercel, el push generó un nuevo despliegue. En </w:t>
+      </w:r>
+      <w:r>
+        <w:rPr>
+          <w:b/>
+          <w:bCs/>
+        </w:rPr>
+        <w:t>Deployments</w:t>
+      </w:r>
+      <w:r>
+        <w:t xml:space="preserve"> aparecen los dos: el primero (commit </w:t>
+      </w:r>
+      <w:r>
+        <w:rPr>
+          <w:rFonts w:ascii="Consolas" w:eastAsia="Consolas" w:hAnsi="Consolas" w:cs="Consolas"/>
+          <w:color w:val="C7254E"/>
+          <w:sz w:val="19"/>
+          <w:szCs w:val="19"/>
+        </w:rPr>
+        <w:t>522b075</w:t>
+      </w:r>
+      <w:r>
+        <w:t xml:space="preserve">) y el nuevo (commit </w:t>
+      </w:r>
+      <w:r>
+        <w:rPr>
+          <w:rFonts w:ascii="Consolas" w:eastAsia="Consolas" w:hAnsi="Consolas" w:cs="Consolas"/>
+          <w:color w:val="C7254E"/>
+          <w:sz w:val="19"/>
+          <w:szCs w:val="19"/>
+        </w:rPr>
+        <w:t>8e535b3</w:t>
+      </w:r>
+      <w:r>
+        <w:t xml:space="preserve">), que ahora es el de </w:t>
+      </w:r>
+      <w:r>
+        <w:rPr>
+          <w:b/>
+          <w:bCs/>
+        </w:rPr>
+        <w:t>Production</w:t>
+      </w:r>
+      <w:r>
+        <w:t>. El build tardó 19 segundos.</w:t>
+      </w:r>
+    </w:p>
+    <w:p>
+      <w:pPr>
+        <w:keepNext/>
+        <w:spacing w:before="120" w:after="60"/>
+        <w:jc w:val="center"/>
+      </w:pPr>
+      <w:r>
+        <w:rPr>
+          <w:noProof/>
+        </w:rPr>
+        <w:drawing>
+          <wp:inline distT="0" distB="0" distL="0" distR="0" wp14:anchorId="12B9D828" wp14:editId="7EA63A30">
+            <wp:extent cx="5715000" cy="1971675"/>
+            <wp:effectExtent l="0" t="0" r="0" b="0"/>
+            <wp:docPr id="488716126" name="g2_13_vercel_deployments.png" descr="Historial de despliegues: cada commit enviado a main genera un deployment nuevo." title="Historial de despliegues: cada commit enviado a main genera un deployment nuevo."/>
+            <wp:cNvGraphicFramePr>
+              <a:graphicFrameLocks xmlns:a="http://schemas.openxmlformats.org/drawingml/2006/main" noChangeAspect="1"/>
+            </wp:cNvGraphicFramePr>
+            <a:graphic xmlns:a="http://schemas.openxmlformats.org/drawingml/2006/main">
+              <a:graphicData uri="http://schemas.openxmlformats.org/drawingml/2006/picture">
+                <pic:pic xmlns:pic="http://schemas.openxmlformats.org/drawingml/2006/picture">
+                  <pic:nvPicPr>
+                    <pic:cNvPr id="0" name=""/>
+                    <pic:cNvPicPr>
+                      <a:picLocks noChangeAspect="1" noChangeArrowheads="1"/>
+                    </pic:cNvPicPr>
+                  </pic:nvPicPr>
+                  <pic:blipFill>
+                    <a:blip r:embed="rId35"/>
+                    <a:srcRect/>
+                    <a:stretch>
+                      <a:fillRect/>
+                    </a:stretch>
+                  </pic:blipFill>
+                  <pic:spPr bwMode="auto">
+                    <a:xfrm>
+                      <a:off x="0" y="0"/>
+                      <a:ext cx="5715000" cy="1971675"/>
+                    </a:xfrm>
+                    <a:prstGeom prst="rect">
+                      <a:avLst/>
+                    </a:prstGeom>
+                  </pic:spPr>
+                </pic:pic>
+              </a:graphicData>
+            </a:graphic>
+          </wp:inline>
+        </w:drawing>
+      </w:r>
+    </w:p>
+    <w:p>
+      <w:pPr>
+        <w:spacing w:after="240"/>
+        <w:jc w:val="center"/>
+      </w:pPr>
+      <w:r>
+        <w:rPr>
+          <w:b/>
+          <w:bCs/>
+          <w:color w:val="595959"/>
+          <w:sz w:val="18"/>
+          <w:szCs w:val="18"/>
+        </w:rPr>
+        <w:t xml:space="preserve">Figura 27. </w:t>
+      </w:r>
+      <w:r>
+        <w:rPr>
+          <w:i/>
+          <w:iCs/>
+          <w:color w:val="595959"/>
+          <w:sz w:val="18"/>
+          <w:szCs w:val="18"/>
+        </w:rPr>
+        <w:t>Historial de despliegues: cada commit enviado a main genera un deployment nuevo.</w:t>
+      </w:r>
+    </w:p>
+    <w:p>
+      <w:pPr>
+        <w:spacing w:after="120" w:line="288" w:lineRule="auto"/>
+      </w:pPr>
+      <w:r>
+        <w:t xml:space="preserve">El panel </w:t>
+      </w:r>
+      <w:r>
+        <w:rPr>
+          <w:b/>
+          <w:bCs/>
+        </w:rPr>
+        <w:t>Overview</w:t>
+      </w:r>
+      <w:r>
+        <w:t xml:space="preserve"> ahora muestra como fuente el commit </w:t>
+      </w:r>
+      <w:r>
+        <w:rPr>
+          <w:rFonts w:ascii="Consolas" w:eastAsia="Consolas" w:hAnsi="Consolas" w:cs="Consolas"/>
+          <w:color w:val="C7254E"/>
+          <w:sz w:val="19"/>
+          <w:szCs w:val="19"/>
+        </w:rPr>
+        <w:t>8e535b3</w:t>
+      </w:r>
+      <w:r>
+        <w:t xml:space="preserve">. El botón </w:t>
+      </w:r>
+      <w:r>
+        <w:rPr>
+          <w:b/>
+          <w:bCs/>
+        </w:rPr>
+        <w:t>Instant Rollback</w:t>
+      </w:r>
+      <w:r>
+        <w:t xml:space="preserve"> permite volver a la versión anterior si un cambio tuviera algún problema.</w:t>
+      </w:r>
+    </w:p>
+    <w:p>
+      <w:pPr>
+        <w:keepNext/>
+        <w:spacing w:before="120" w:after="60"/>
+        <w:jc w:val="center"/>
+      </w:pPr>
+      <w:r>
+        <w:rPr>
+          <w:noProof/>
+        </w:rPr>
+        <w:drawing>
+          <wp:inline distT="0" distB="0" distL="0" distR="0" wp14:anchorId="4A134477" wp14:editId="60365AFA">
+            <wp:extent cx="5715000" cy="2781300"/>
+            <wp:effectExtent l="0" t="0" r="0" b="0"/>
+            <wp:docPr id="272193187" name="g2_14_vercel_overview_actualizado.png" descr="Producción actualizada con el commit 8e535b3." title="Producción actualizada con el commit 8e535b3."/>
+            <wp:cNvGraphicFramePr>
+              <a:graphicFrameLocks xmlns:a="http://schemas.openxmlformats.org/drawingml/2006/main" noChangeAspect="1"/>
+            </wp:cNvGraphicFramePr>
+            <a:graphic xmlns:a="http://schemas.openxmlformats.org/drawingml/2006/main">
+              <a:graphicData uri="http://schemas.openxmlformats.org/drawingml/2006/picture">
+                <pic:pic xmlns:pic="http://schemas.openxmlformats.org/drawingml/2006/picture">
+                  <pic:nvPicPr>
+                    <pic:cNvPr id="0" name=""/>
+                    <pic:cNvPicPr>
+                      <a:picLocks noChangeAspect="1" noChangeArrowheads="1"/>
+                    </pic:cNvPicPr>
+                  </pic:nvPicPr>
+                  <pic:blipFill>
+                    <a:blip r:embed="rId36"/>
+                    <a:srcRect/>
+                    <a:stretch>
+                      <a:fillRect/>
+                    </a:stretch>
+                  </pic:blipFill>
+                  <pic:spPr bwMode="auto">
+                    <a:xfrm>
+                      <a:off x="0" y="0"/>
+                      <a:ext cx="5715000" cy="2781300"/>
+                    </a:xfrm>
+                    <a:prstGeom prst="rect">
+                      <a:avLst/>
+                    </a:prstGeom>
+                  </pic:spPr>
+                </pic:pic>
+              </a:graphicData>
+            </a:graphic>
+          </wp:inline>
+        </w:drawing>
+      </w:r>
+    </w:p>
+    <w:p>
+      <w:pPr>
+        <w:spacing w:after="240"/>
+        <w:jc w:val="center"/>
+      </w:pPr>
+      <w:r>
+        <w:rPr>
+          <w:b/>
+          <w:bCs/>
+          <w:color w:val="595959"/>
+          <w:sz w:val="18"/>
+          <w:szCs w:val="18"/>
+        </w:rPr>
+        <w:t xml:space="preserve">Figura 28. </w:t>
+      </w:r>
+      <w:r>
+        <w:rPr>
+          <w:i/>
+          <w:iCs/>
+          <w:color w:val="595959"/>
+          <w:sz w:val="18"/>
+          <w:szCs w:val="18"/>
+        </w:rPr>
+        <w:t>Producción actualizada con el commit 8e535b3.</w:t>
+      </w:r>
+    </w:p>
+    <w:p>
+      <w:pPr>
+        <w:spacing w:after="120" w:line="288" w:lineRule="auto"/>
+      </w:pPr>
+      <w:r>
+        <w:t>Al recargar el sitio publicado ya aparece el cambio:</w:t>
+      </w:r>
+    </w:p>
+    <w:p>
+      <w:pPr>
+        <w:keepNext/>
+        <w:spacing w:before="120" w:after="60"/>
+        <w:jc w:val="center"/>
+      </w:pPr>
+      <w:r>
+        <w:rPr>
+          <w:noProof/>
+        </w:rPr>
+        <w:drawing>
+          <wp:inline distT="0" distB="0" distL="0" distR="0" wp14:anchorId="204D092E" wp14:editId="4665F3D1">
+            <wp:extent cx="5715000" cy="3790950"/>
+            <wp:effectExtent l="0" t="0" r="0" b="0"/>
+            <wp:docPr id="2066948293" name="g2_15_sitio_actualizado.png" descr="Botón «Ver sitio publicado» en la página del proyecto, ya en producción." title="Botón «Ver sitio publicado» en la página del proyecto, ya en producción."/>
+            <wp:cNvGraphicFramePr>
+              <a:graphicFrameLocks xmlns:a="http://schemas.openxmlformats.org/drawingml/2006/main" noChangeAspect="1"/>
+            </wp:cNvGraphicFramePr>
+            <a:graphic xmlns:a="http://schemas.openxmlformats.org/drawingml/2006/main">
+              <a:graphicData uri="http://schemas.openxmlformats.org/drawingml/2006/picture">
+                <pic:pic xmlns:pic="http://schemas.openxmlformats.org/drawingml/2006/picture">
+                  <pic:nvPicPr>
+                    <pic:cNvPr id="0" name=""/>
+                    <pic:cNvPicPr>
+                      <a:picLocks noChangeAspect="1" noChangeArrowheads="1"/>
+                    </pic:cNvPicPr>
+                  </pic:nvPicPr>
+                  <pic:blipFill>
+                    <a:blip r:embed="rId37"/>
+                    <a:srcRect/>
+                    <a:stretch>
+                      <a:fillRect/>
+                    </a:stretch>
+                  </pic:blipFill>
+                  <pic:spPr bwMode="auto">
+                    <a:xfrm>
+                      <a:off x="0" y="0"/>
+                      <a:ext cx="5715000" cy="3790950"/>
+                    </a:xfrm>
+                    <a:prstGeom prst="rect">
+                      <a:avLst/>
+                    </a:prstGeom>
+                  </pic:spPr>
+                </pic:pic>
+              </a:graphicData>
+            </a:graphic>
+          </wp:inline>
+        </w:drawing>
+      </w:r>
+    </w:p>
+    <w:p>
+      <w:pPr>
+        <w:spacing w:after="240"/>
+        <w:jc w:val="center"/>
+      </w:pPr>
+      <w:r>
+        <w:rPr>
+          <w:b/>
+          <w:bCs/>
+          <w:color w:val="595959"/>
+          <w:sz w:val="18"/>
+          <w:szCs w:val="18"/>
+        </w:rPr>
+        <w:t xml:space="preserve">Figura 29. </w:t>
+      </w:r>
+      <w:r>
+        <w:rPr>
+          <w:i/>
+          <w:iCs/>
+          <w:color w:val="595959"/>
+          <w:sz w:val="18"/>
+          <w:szCs w:val="18"/>
+        </w:rPr>
+        <w:t>Botón «Ver sitio publicado» en la página del proyecto, ya en producción.</w:t>
+      </w:r>
+    </w:p>
+    <w:p>
+      <w:pPr>
+        <w:pStyle w:val="Ttulo2"/>
+        <w:shd w:val="clear" w:color="auto" w:fill="31849B"/>
+        <w:spacing w:before="320" w:after="200"/>
+        <w:jc w:val="center"/>
+      </w:pPr>
+      <w:bookmarkStart w:id="27" w:name="_Toc241060438"/>
+      <w:r>
+        <w:rPr>
+          <w:color w:val="FFFFFF"/>
+          <w:sz w:val="24"/>
+          <w:szCs w:val="24"/>
+        </w:rPr>
+        <w:t>ANÁLISIS DE RESULTADOS</w:t>
+      </w:r>
+      <w:bookmarkEnd w:id="27"/>
+    </w:p>
+    <w:p>
+      <w:pPr>
+        <w:spacing w:after="120" w:line="288" w:lineRule="auto"/>
+      </w:pPr>
+      <w:r>
+        <w:t>La guía pide añadir el portafolio web a los documentos del módulo 3.7: currículum vitae, hoja de vida, LinkedIn y GitHub.</w:t>
+      </w:r>
+    </w:p>
+    <w:p>
+      <w:pPr>
+        <w:pStyle w:val="Ttulo3"/>
+      </w:pPr>
+      <w:bookmarkStart w:id="28" w:name="_Toc241060439"/>
+      <w:r>
+        <w:t>Currículum vitae y hoja de vida</w:t>
+      </w:r>
+      <w:bookmarkEnd w:id="28"/>
+    </w:p>
+    <w:p>
+      <w:pPr>
+        <w:spacing w:after="120" w:line="288" w:lineRule="auto"/>
+      </w:pPr>
+      <w:r>
+        <w:t xml:space="preserve">Se agregaron dos líneas en los datos personales del CV del módulo 3.7: </w:t>
+      </w:r>
+      <w:r>
+        <w:rPr>
+          <w:b/>
+          <w:bCs/>
+        </w:rPr>
+        <w:t>Portafolio web</w:t>
+      </w:r>
+      <w:r>
+        <w:t xml:space="preserve"> (modulo239.vercel.app) y </w:t>
+      </w:r>
+      <w:r>
+        <w:rPr>
+          <w:b/>
+          <w:bCs/>
+        </w:rPr>
+        <w:t>GitHub</w:t>
+      </w:r>
+      <w:r>
+        <w:t xml:space="preserve"> (github.com/Cdanielnam), ambas como enlaces. El CV se mantiene en una sola página. En la captura se ocultaron la fecha de nacimiento y el teléfono porque este documento es público en GitHub.</w:t>
+      </w:r>
+    </w:p>
+    <w:p>
+      <w:pPr>
+        <w:keepNext/>
+        <w:spacing w:before="120" w:after="60"/>
+        <w:jc w:val="center"/>
+      </w:pPr>
+      <w:r>
+        <w:rPr>
+          <w:noProof/>
+        </w:rPr>
+        <w:drawing>
+          <wp:inline distT="0" distB="0" distL="0" distR="0" wp14:anchorId="5047650D" wp14:editId="5DFC928A">
+            <wp:extent cx="5715000" cy="2085975"/>
+            <wp:effectExtent l="0" t="0" r="0" b="0"/>
+            <wp:docPr id="145488891" name="g2_16_cv_actualizado.png" descr="Datos personales del CV con los enlaces al portafolio y a GitHub." title="Datos personales del CV con los enlaces al portafolio y a GitHub."/>
+            <wp:cNvGraphicFramePr>
+              <a:graphicFrameLocks xmlns:a="http://schemas.openxmlformats.org/drawingml/2006/main" noChangeAspect="1"/>
+            </wp:cNvGraphicFramePr>
+            <a:graphic xmlns:a="http://schemas.openxmlformats.org/drawingml/2006/main">
+              <a:graphicData uri="http://schemas.openxmlformats.org/drawingml/2006/picture">
+                <pic:pic xmlns:pic="http://schemas.openxmlformats.org/drawingml/2006/picture">
+                  <pic:nvPicPr>
+                    <pic:cNvPr id="0" name=""/>
+                    <pic:cNvPicPr>
+                      <a:picLocks noChangeAspect="1" noChangeArrowheads="1"/>
+                    </pic:cNvPicPr>
+                  </pic:nvPicPr>
+                  <pic:blipFill>
+                    <a:blip r:embed="rId38"/>
+                    <a:srcRect/>
+                    <a:stretch>
+                      <a:fillRect/>
+                    </a:stretch>
+                  </pic:blipFill>
+                  <pic:spPr bwMode="auto">
+                    <a:xfrm>
+                      <a:off x="0" y="0"/>
+                      <a:ext cx="5715000" cy="2085975"/>
+                    </a:xfrm>
+                    <a:prstGeom prst="rect">
+                      <a:avLst/>
+                    </a:prstGeom>
+                  </pic:spPr>
+                </pic:pic>
+              </a:graphicData>
+            </a:graphic>
+          </wp:inline>
+        </w:drawing>
+      </w:r>
+    </w:p>
+    <w:p>
+      <w:pPr>
+        <w:spacing w:after="240"/>
+        <w:jc w:val="center"/>
+      </w:pPr>
+      <w:r>
+        <w:rPr>
+          <w:b/>
+          <w:bCs/>
+          <w:color w:val="595959"/>
+          <w:sz w:val="18"/>
+          <w:szCs w:val="18"/>
+        </w:rPr>
+        <w:t xml:space="preserve">Figura 30. </w:t>
+      </w:r>
+      <w:r>
+        <w:rPr>
+          <w:i/>
+          <w:iCs/>
+          <w:color w:val="595959"/>
+          <w:sz w:val="18"/>
+          <w:szCs w:val="18"/>
+        </w:rPr>
+        <w:t>Datos personales del CV con los enlaces al portafolio y a GitHub.</w:t>
+      </w:r>
+    </w:p>
+    <w:p>
+      <w:pPr>
+        <w:pStyle w:val="Ttulo3"/>
+      </w:pPr>
+      <w:bookmarkStart w:id="29" w:name="_Toc241060440"/>
+      <w:r>
+        <w:t>GitHub</w:t>
+      </w:r>
+      <w:bookmarkEnd w:id="29"/>
     </w:p>
     <w:p>
       <w:pPr>
@@ -7414,63 +8811,17 @@
         <w:spacing w:after="60" w:line="276" w:lineRule="auto"/>
       </w:pPr>
       <w:r>
-        <w:t xml:space="preserve">Hacer un nuevo </w:t>
-      </w:r>
-      <w:r>
-        <w:rPr>
-          <w:rFonts w:ascii="Consolas" w:eastAsia="Consolas" w:hAnsi="Consolas" w:cs="Consolas"/>
-          <w:color w:val="C7254E"/>
-          <w:sz w:val="19"/>
-          <w:szCs w:val="19"/>
-        </w:rPr>
-        <w:t>git push</w:t>
-      </w:r>
-      <w:r>
-        <w:t xml:space="preserve"> y comprobar en </w:t>
+        <w:t xml:space="preserve">El README del repositorio modulo239 muestra el enlace </w:t>
       </w:r>
       <w:r>
         <w:rPr>
           <w:b/>
           <w:bCs/>
         </w:rPr>
-        <w:t>Deployments</w:t>
-      </w:r>
-      <w:r>
-        <w:t xml:space="preserve"> que Vercel generó un despliegue automático.</w:t>
-      </w:r>
-    </w:p>
-    <w:p>
-      <w:pPr>
-        <w:pStyle w:val="Ttulo2"/>
-        <w:shd w:val="clear" w:color="auto" w:fill="31849B"/>
-        <w:spacing w:before="320" w:after="200"/>
-        <w:jc w:val="center"/>
-      </w:pPr>
-      <w:bookmarkStart w:id="24" w:name="_Toc241059009"/>
-      <w:r>
-        <w:rPr>
-          <w:color w:val="FFFFFF"/>
-          <w:sz w:val="24"/>
-          <w:szCs w:val="24"/>
-        </w:rPr>
-        <w:t>ANÁLISIS DE RESULTADOS</w:t>
-      </w:r>
-      <w:bookmarkEnd w:id="24"/>
-    </w:p>
-    <w:p>
-      <w:pPr>
-        <w:spacing w:after="120" w:line="288" w:lineRule="auto"/>
-      </w:pPr>
-      <w:r>
-        <w:t>La guía pide añadir el portafolio web a los documentos del módulo 3.7: currículum vitae, hoja de vida, LinkedIn y GitHub.</w:t>
-      </w:r>
-    </w:p>
-    <w:p>
-      <w:pPr>
-        <w:spacing w:after="120" w:line="288" w:lineRule="auto"/>
-      </w:pPr>
-      <w:r>
-        <w:t>Como el sitio todavía no está publicado, el enlace del portafolio se agregará a esos documentos cuando se complete el despliegue en Vercel. Mientras tanto, el código fuente ya está disponible en GitHub y el portafolio enlaza al perfil del estudiante.</w:t>
+        <w:t>Sitio publicado: https://modulo239.vercel.app</w:t>
+      </w:r>
+      <w:r>
+        <w:t>.</w:t>
       </w:r>
     </w:p>
     <w:p>
@@ -7483,15 +8834,57 @@
         <w:spacing w:after="60" w:line="276" w:lineRule="auto"/>
       </w:pPr>
       <w:r>
+        <w:t>El portafolio enlaza de vuelta al perfil github.com/Cdanielnam y al código fuente en el pie de página.</w:t>
+      </w:r>
+    </w:p>
+    <w:p>
+      <w:pPr>
+        <w:pStyle w:val="Ttulo3"/>
+      </w:pPr>
+      <w:bookmarkStart w:id="30" w:name="_Toc241060441"/>
+      <w:r>
+        <w:t>LinkedIn</w:t>
+      </w:r>
+      <w:bookmarkEnd w:id="30"/>
+    </w:p>
+    <w:p>
+      <w:pPr>
+        <w:spacing w:after="120" w:line="288" w:lineRule="auto"/>
+      </w:pPr>
+      <w:r>
+        <w:t xml:space="preserve">En el perfil de LinkedIn el enlace se agrega en </w:t>
+      </w:r>
+      <w:r>
         <w:rPr>
           <w:b/>
           <w:bCs/>
         </w:rPr>
-        <w:t>Currículum vitae y hoja de vida:</w:t>
-      </w:r>
-      <w:r>
-        <w:t xml:space="preserve"> agregar la URL del portafolio y del perfil de GitHub en los datos personales.</w:t>
-      </w:r>
+        <w:t>Información de contacto → Sitio web</w:t>
+      </w:r>
+      <w:r>
+        <w:t xml:space="preserve"> (tipo Portafolio) y en la sección </w:t>
+      </w:r>
+      <w:r>
+        <w:rPr>
+          <w:b/>
+          <w:bCs/>
+        </w:rPr>
+        <w:t>Destacado → Agregar un enlace</w:t>
+      </w:r>
+      <w:r>
+        <w:t>, con la URL https://modulo239.vercel.app.</w:t>
+      </w:r>
+    </w:p>
+    <w:p>
+      <w:pPr>
+        <w:pStyle w:val="Ttulo1"/>
+        <w:pageBreakBefore/>
+      </w:pPr>
+      <w:bookmarkStart w:id="31" w:name="_Toc241060442"/>
+      <w:r>
+        <w:t>Conclusiones</w:t>
+      </w:r>
+      <w:bookmarkEnd w:id="31"/>
     </w:p>
     <w:p>
       <w:pPr>
@@ -7503,14 +8896,7 @@
         <w:spacing w:after="60" w:line="276" w:lineRule="auto"/>
       </w:pPr>
       <w:r>
-        <w:rPr>
-          <w:b/>
-          <w:bCs/>
-        </w:rPr>
-        <w:t>LinkedIn:</w:t>
-      </w:r>
-      <w:r>
-        <w:t xml:space="preserve"> agregar el portafolio en la sección de contacto (sitio web) y como elemento destacado.</w:t>
+        <w:t>El App Router de Next.js organiza las rutas con carpetas: el portafolio tiene una página principal y 9 páginas de proyecto que se generan de forma estática a partir de una sola ruta dinámica.</w:t>
       </w:r>
     </w:p>
     <w:p>
@@ -7523,26 +8909,8 @@
         <w:spacing w:after="60" w:line="276" w:lineRule="auto"/>
       </w:pPr>
       <w:r>
-        <w:rPr>
-          <w:b/>
-          <w:bCs/>
-        </w:rPr>
-        <w:t>GitHub:</w:t>
-      </w:r>
-      <w:r>
-        <w:t xml:space="preserve"> colocar la URL del portafolio en el campo Website del repositorio modulo239 y en el README.</w:t>
-      </w:r>
-    </w:p>
-    <w:p>
-      <w:pPr>
-        <w:pStyle w:val="Ttulo1"/>
-        <w:pageBreakBefore/>
-      </w:pPr>
-      <w:bookmarkStart w:id="25" w:name="_Toc241059010"/>
-      <w:r>
-        <w:t>Conclusiones</w:t>
-      </w:r>
-      <w:bookmarkEnd w:id="25"/>
+        <w:t>Separar Server y Client Components mantiene casi todo el sitio renderizado en el servidor; solo el menú móvil y el filtro de proyectos necesitan ejecutarse en el navegador.</w:t>
+      </w:r>
     </w:p>
     <w:p>
       <w:pPr>
@@ -7554,7 +8922,7 @@
         <w:spacing w:after="60" w:line="276" w:lineRule="auto"/>
       </w:pPr>
       <w:r>
-        <w:t>El App Router de Next.js organiza las rutas con carpetas: el portafolio tiene una página principal y 9 páginas de proyecto que se generan de forma estática a partir de una sola ruta dinámica.</w:t>
+        <w:t>La consola de desarrollo de Next.js indica el archivo, la línea y la columna de cada error, lo que acelera su corrección.</w:t>
       </w:r>
     </w:p>
     <w:p>
@@ -7567,7 +8935,7 @@
         <w:spacing w:after="60" w:line="276" w:lineRule="auto"/>
       </w:pPr>
       <w:r>
-        <w:t>Separar Server y Client Components mantiene casi todo el sitio renderizado en el servidor; solo el menú móvil y el filtro de proyectos necesitan ejecutarse en el navegador.</w:t>
+        <w:t>Al conectar GitHub con Vercel, publicar una actualización se reduce a hacer git push: Vercel detectó el cambio, construyó y publicó la nueva versión en menos de medio minuto.</w:t>
       </w:r>
     </w:p>
     <w:p>
@@ -7580,20 +8948,7 @@
         <w:spacing w:after="60" w:line="276" w:lineRule="auto"/>
       </w:pPr>
       <w:r>
-        <w:t>La consola de desarrollo de Next.js indica el archivo, la línea y la columna de cada error, lo que acelera su corrección.</w:t>
-      </w:r>
-    </w:p>
-    <w:p>
-      <w:pPr>
-        <w:pStyle w:val="Prrafodelista"/>
-        <w:numPr>
-          <w:ilvl w:val="0"/>
-          <w:numId w:val="2"/>
-        </w:numPr>
-        <w:spacing w:after="60" w:line="276" w:lineRule="auto"/>
-      </w:pPr>
-      <w:r>
-        <w:t>Git y GitHub dejan un historial de cada cambio: el proyecto quedó publicado en github.com/Cdanielnam/modulo239, listo para conectarse con Vercel y desplegarse automáticamente con cada push.</w:t>
+        <w:t>El historial de despliegues relaciona cada versión publicada con su commit y permite regresar a una versión anterior con Instant Rollback.</w:t>
       </w:r>
     </w:p>
     <w:p>
@@ -7605,11 +8960,11 @@
       <w:pPr>
         <w:pStyle w:val="Ttulo2"/>
       </w:pPr>
-      <w:bookmarkStart w:id="26" w:name="_Toc241059011"/>
+      <w:bookmarkStart w:id="32" w:name="_Toc241060443"/>
       <w:r>
         <w:t>Enlaces del proyecto</w:t>
       </w:r>
-      <w:bookmarkEnd w:id="26"/>
+      <w:bookmarkEnd w:id="32"/>
     </w:p>
     <w:p>
       <w:pPr>
@@ -7622,7 +8977,7 @@
         </w:rPr>
         <w:t xml:space="preserve">Repositorio: </w:t>
       </w:r>
-      <w:hyperlink r:id="rId32" w:history="1">
+      <w:hyperlink r:id="rId39" w:history="1">
         <w:r>
           <w:rPr>
             <w:rStyle w:val="Hipervnculo"/>
@@ -7633,6 +8988,26 @@
     </w:p>
     <w:p>
       <w:pPr>
+        <w:spacing w:after="120" w:line="288" w:lineRule="auto"/>
+      </w:pPr>
+      <w:r>
+        <w:rPr>
+          <w:b/>
+          <w:bCs/>
+        </w:rPr>
+        <w:t xml:space="preserve">Sitio publicado: </w:t>
+      </w:r>
+      <w:hyperlink r:id="rId40" w:history="1">
+        <w:r>
+          <w:rPr>
+            <w:rStyle w:val="Hipervnculo"/>
+          </w:rPr>
+          <w:t>https://modulo239.vercel.app</w:t>
+        </w:r>
+      </w:hyperlink>
+    </w:p>
+    <w:p>
+      <w:pPr>
         <w:spacing w:after="120"/>
       </w:pPr>
     </w:p>
@@ -7643,7 +9018,7 @@
         <w:spacing w:before="320" w:after="200"/>
         <w:jc w:val="center"/>
       </w:pPr>
-      <w:bookmarkStart w:id="27" w:name="_Toc241059012"/>
+      <w:bookmarkStart w:id="33" w:name="_Toc241060444"/>
       <w:r>
         <w:rPr>
           <w:color w:val="FFFFFF"/>
@@ -7652,7 +9027,7 @@
         </w:rPr>
         <w:t>BIBLIOGRAFÍA</w:t>
       </w:r>
-      <w:bookmarkEnd w:id="27"/>
+      <w:bookmarkEnd w:id="33"/>
     </w:p>
     <w:p>
       <w:pPr>
@@ -7807,10 +9182,10 @@
       </w:r>
     </w:p>
     <w:sectPr>
-      <w:headerReference w:type="default" r:id="rId33"/>
-      <w:footerReference w:type="default" r:id="rId34"/>
-      <w:headerReference w:type="first" r:id="rId35"/>
-      <w:footerReference w:type="first" r:id="rId36"/>
+      <w:headerReference w:type="default" r:id="rId41"/>
+      <w:footerReference w:type="default" r:id="rId42"/>
+      <w:headerReference w:type="first" r:id="rId43"/>
+      <w:footerReference w:type="first" r:id="rId44"/>
       <w:pgSz w:w="11906" w:h="16838"/>
       <w:pgMar w:top="1134" w:right="1134" w:bottom="1134" w:left="1134" w:header="567" w:footer="567" w:gutter="0"/>
       <w:cols w:space="720"/>
@@ -8014,10 +9389,96 @@
 <file path=word/numbering.xml><?xml version="1.0" encoding="utf-8"?>
 <w:numbering xmlns:wpc="http://schemas.microsoft.com/office/word/2010/wordprocessingCanvas" xmlns:cx="http://schemas.microsoft.com/office/drawing/2014/chartex" xmlns:cx1="http://schemas.microsoft.com/office/drawing/2015/9/8/chartex" xmlns:cx2="http://schemas.microsoft.com/office/drawing/2015/10/21/chartex" xmlns:cx3="http://schemas.microsoft.com/office/drawing/2016/5/9/chartex" xmlns:cx4="http://schemas.microsoft.com/office/drawing/2016/5/10/chartex" xmlns:cx5="http://schemas.microsoft.com/office/drawing/2016/5/11/chartex" xmlns:cx6="http://schemas.microsoft.com/office/drawing/2016/5/12/chartex" xmlns:cx7="http://schemas.microsoft.com/office/drawing/2016/5/13/chartex" xmlns:cx8="http://schemas.microsoft.com/office/drawing/2016/5/14/chartex" xmlns:mc="http://schemas.openxmlformats.org/markup-compatibility/2006" xmlns:aink="http://schemas.microsoft.com/office/drawing/2016/ink" xmlns:am3d="http://schemas.microsoft.com/office/drawing/2017/model3d" xmlns:o="urn:schemas-microsoft-com:office:office" xmlns:oel="http://schemas.microsoft.com/office/2019/extlst" xmlns:r="http://schemas.openxmlformats.org/officeDocument/2006/relationships" xmlns:m="http://schemas.openxmlformats.org/officeDocument/2006/math" xmlns:v="urn:schemas-microsoft-com:vml" xmlns:wp14="http://schemas.microsoft.com/office/word/2010/wordprocessingDrawing" xmlns:wp="http://schemas.openxmlformats.org/drawingml/2006/wordprocessingDrawing" xmlns:w10="urn:schemas-microsoft-com:office:word" xmlns:w="http://schemas.openxmlformats.org/wordprocessingml/2006/main" xmlns:w14="http://schemas.microsoft.com/office/word/2010/wordml" xmlns:w15="http://schemas.microsoft.com/office/word/2012/wordml" xmlns:w16cex="http://schemas.microsoft.com/office/word/2018/wordml/cex" xmlns:w16cid="http://schemas.microsoft.com/office/word/2016/wordml/cid" xmlns:w16="http://schemas.microsoft.com/office/word/2018/wordml" xmlns:w16du="http://schemas.microsoft.com/office/word/2023/wordml/word16du" xmlns:w16sdtdh="http://schemas.microsoft.com/office/word/2020/wordml/sdtdatahash" xmlns:w16sdtfl="http://schemas.microsoft.com/office/word/2024/wordml/sdtformatlock" xmlns:w16se="http://schemas.microsoft.com/office/word/2015/wordml/symex" xmlns:wpg="http://schemas.microsoft.com/office/word/2010/wordprocessingGroup" xmlns:wpi="http://schemas.microsoft.com/office/word/2010/wordprocessingInk" xmlns:wne="http://schemas.microsoft.com/office/word/2006/wordml" xmlns:wps="http://schemas.microsoft.com/office/word/2010/wordprocessingShape" mc:Ignorable="w14 w15 w16se w16cid w16 w16cex w16sdtdh w16sdtfl w16du wp14">
   <w:abstractNum w:abstractNumId="0" w15:restartNumberingAfterBreak="0">
-    <w:nsid w:val="16725782"/>
+    <w:nsid w:val="1AE15AD3"/>
     <w:multiLevelType w:val="hybridMultilevel"/>
-    <w:tmpl w:val="B8A402FE"/>
-    <w:lvl w:ilvl="0" w:tplc="2178418C">
+    <w:tmpl w:val="542204BA"/>
+    <w:lvl w:ilvl="0" w:tplc="C95C665A">
+      <w:start w:val="1"/>
+      <w:numFmt w:val="bullet"/>
+      <w:lvlText w:val="●"/>
+      <w:lvlJc w:val="left"/>
+      <w:pPr>
+        <w:ind w:left="720" w:hanging="360"/>
+      </w:pPr>
+    </w:lvl>
+    <w:lvl w:ilvl="1" w:tplc="150E1800">
+      <w:start w:val="1"/>
+      <w:numFmt w:val="bullet"/>
+      <w:lvlText w:val="○"/>
+      <w:lvlJc w:val="left"/>
+      <w:pPr>
+        <w:ind w:left="1440" w:hanging="360"/>
+      </w:pPr>
+    </w:lvl>
+    <w:lvl w:ilvl="2" w:tplc="FFF4B974">
+      <w:start w:val="1"/>
+      <w:numFmt w:val="bullet"/>
+      <w:lvlText w:val="■"/>
+      <w:lvlJc w:val="left"/>
+      <w:pPr>
+        <w:ind w:left="2160" w:hanging="360"/>
+      </w:pPr>
+    </w:lvl>
+    <w:lvl w:ilvl="3" w:tplc="1D70BFB4">
+      <w:start w:val="1"/>
+      <w:numFmt w:val="bullet"/>
+      <w:lvlText w:val="●"/>
+      <w:lvlJc w:val="left"/>
+      <w:pPr>
+        <w:ind w:left="2880" w:hanging="360"/>
+      </w:pPr>
+    </w:lvl>
+    <w:lvl w:ilvl="4" w:tplc="CD06196E">
+      <w:start w:val="1"/>
+      <w:numFmt w:val="bullet"/>
+      <w:lvlText w:val="○"/>
+      <w:lvlJc w:val="left"/>
+      <w:pPr>
+        <w:ind w:left="3600" w:hanging="360"/>
+      </w:pPr>
+    </w:lvl>
+    <w:lvl w:ilvl="5" w:tplc="127C94DA">
+      <w:start w:val="1"/>
+      <w:numFmt w:val="bullet"/>
+      <w:lvlText w:val="■"/>
+      <w:lvlJc w:val="left"/>
+      <w:pPr>
+        <w:ind w:left="4320" w:hanging="360"/>
+      </w:pPr>
+    </w:lvl>
+    <w:lvl w:ilvl="6" w:tplc="D8C4854C">
+      <w:start w:val="1"/>
+      <w:numFmt w:val="bullet"/>
+      <w:lvlText w:val="●"/>
+      <w:lvlJc w:val="left"/>
+      <w:pPr>
+        <w:ind w:left="5040" w:hanging="360"/>
+      </w:pPr>
+    </w:lvl>
+    <w:lvl w:ilvl="7" w:tplc="3BC0AC50">
+      <w:start w:val="1"/>
+      <w:numFmt w:val="bullet"/>
+      <w:lvlText w:val="●"/>
+      <w:lvlJc w:val="left"/>
+      <w:pPr>
+        <w:ind w:left="5760" w:hanging="360"/>
+      </w:pPr>
+    </w:lvl>
+    <w:lvl w:ilvl="8" w:tplc="F380FEE4">
+      <w:start w:val="1"/>
+      <w:numFmt w:val="bullet"/>
+      <w:lvlText w:val="●"/>
+      <w:lvlJc w:val="left"/>
+      <w:pPr>
+        <w:ind w:left="6480" w:hanging="360"/>
+      </w:pPr>
+    </w:lvl>
+  </w:abstractNum>
+  <w:abstractNum w:abstractNumId="1" w15:restartNumberingAfterBreak="0">
+    <w:nsid w:val="1E671D7F"/>
+    <w:multiLevelType w:val="hybridMultilevel"/>
+    <w:tmpl w:val="963E7562"/>
+    <w:lvl w:ilvl="0" w:tplc="A2E0F072">
       <w:start w:val="1"/>
       <w:numFmt w:val="decimal"/>
       <w:lvlText w:val="%1."/>
@@ -8026,138 +9487,52 @@
         <w:ind w:left="720" w:hanging="360"/>
       </w:pPr>
     </w:lvl>
-    <w:lvl w:ilvl="1" w:tplc="EA8A4AF8">
+    <w:lvl w:ilvl="1" w:tplc="C5F6ED88">
       <w:numFmt w:val="decimal"/>
       <w:lvlText w:val=""/>
       <w:lvlJc w:val="left"/>
     </w:lvl>
-    <w:lvl w:ilvl="2" w:tplc="9FA89678">
+    <w:lvl w:ilvl="2" w:tplc="208617A4">
       <w:numFmt w:val="decimal"/>
       <w:lvlText w:val=""/>
       <w:lvlJc w:val="left"/>
     </w:lvl>
-    <w:lvl w:ilvl="3" w:tplc="0FE2996A">
+    <w:lvl w:ilvl="3" w:tplc="6A5E11C4">
       <w:numFmt w:val="decimal"/>
       <w:lvlText w:val=""/>
       <w:lvlJc w:val="left"/>
     </w:lvl>
-    <w:lvl w:ilvl="4" w:tplc="E70C6C16">
+    <w:lvl w:ilvl="4" w:tplc="DC72955A">
       <w:numFmt w:val="decimal"/>
       <w:lvlText w:val=""/>
       <w:lvlJc w:val="left"/>
     </w:lvl>
-    <w:lvl w:ilvl="5" w:tplc="0A908626">
+    <w:lvl w:ilvl="5" w:tplc="2F983FC2">
       <w:numFmt w:val="decimal"/>
       <w:lvlText w:val=""/>
       <w:lvlJc w:val="left"/>
     </w:lvl>
-    <w:lvl w:ilvl="6" w:tplc="08588672">
+    <w:lvl w:ilvl="6" w:tplc="59AA27F6">
       <w:numFmt w:val="decimal"/>
       <w:lvlText w:val=""/>
       <w:lvlJc w:val="left"/>
     </w:lvl>
-    <w:lvl w:ilvl="7" w:tplc="56BE1BCE">
+    <w:lvl w:ilvl="7" w:tplc="5F361242">
       <w:numFmt w:val="decimal"/>
       <w:lvlText w:val=""/>
       <w:lvlJc w:val="left"/>
     </w:lvl>
-    <w:lvl w:ilvl="8" w:tplc="F7ECE5AA">
+    <w:lvl w:ilvl="8" w:tplc="C9D44DE6">
       <w:numFmt w:val="decimal"/>
       <w:lvlText w:val=""/>
       <w:lvlJc w:val="left"/>
     </w:lvl>
   </w:abstractNum>
-  <w:abstractNum w:abstractNumId="1" w15:restartNumberingAfterBreak="0">
-    <w:nsid w:val="1E683B47"/>
+  <w:abstractNum w:abstractNumId="2" w15:restartNumberingAfterBreak="0">
+    <w:nsid w:val="62B034AD"/>
     <w:multiLevelType w:val="hybridMultilevel"/>
-    <w:tmpl w:val="98B869D0"/>
-    <w:lvl w:ilvl="0" w:tplc="C390FE10">
-      <w:start w:val="1"/>
-      <w:numFmt w:val="bullet"/>
-      <w:lvlText w:val="●"/>
-      <w:lvlJc w:val="left"/>
-      <w:pPr>
-        <w:ind w:left="720" w:hanging="360"/>
-      </w:pPr>
-    </w:lvl>
-    <w:lvl w:ilvl="1" w:tplc="302C8CA2">
-      <w:start w:val="1"/>
-      <w:numFmt w:val="bullet"/>
-      <w:lvlText w:val="○"/>
-      <w:lvlJc w:val="left"/>
-      <w:pPr>
-        <w:ind w:left="1440" w:hanging="360"/>
-      </w:pPr>
-    </w:lvl>
-    <w:lvl w:ilvl="2" w:tplc="9FF88B66">
-      <w:start w:val="1"/>
-      <w:numFmt w:val="bullet"/>
-      <w:lvlText w:val="■"/>
-      <w:lvlJc w:val="left"/>
-      <w:pPr>
-        <w:ind w:left="2160" w:hanging="360"/>
-      </w:pPr>
-    </w:lvl>
-    <w:lvl w:ilvl="3" w:tplc="52421596">
-      <w:start w:val="1"/>
-      <w:numFmt w:val="bullet"/>
-      <w:lvlText w:val="●"/>
-      <w:lvlJc w:val="left"/>
-      <w:pPr>
-        <w:ind w:left="2880" w:hanging="360"/>
-      </w:pPr>
-    </w:lvl>
-    <w:lvl w:ilvl="4" w:tplc="A0F44270">
-      <w:start w:val="1"/>
-      <w:numFmt w:val="bullet"/>
-      <w:lvlText w:val="○"/>
-      <w:lvlJc w:val="left"/>
-      <w:pPr>
-        <w:ind w:left="3600" w:hanging="360"/>
-      </w:pPr>
-    </w:lvl>
-    <w:lvl w:ilvl="5" w:tplc="20467766">
-      <w:start w:val="1"/>
-      <w:numFmt w:val="bullet"/>
-      <w:lvlText w:val="■"/>
-      <w:lvlJc w:val="left"/>
-      <w:pPr>
-        <w:ind w:left="4320" w:hanging="360"/>
-      </w:pPr>
-    </w:lvl>
-    <w:lvl w:ilvl="6" w:tplc="06ECDC06">
-      <w:start w:val="1"/>
-      <w:numFmt w:val="bullet"/>
-      <w:lvlText w:val="●"/>
-      <w:lvlJc w:val="left"/>
-      <w:pPr>
-        <w:ind w:left="5040" w:hanging="360"/>
-      </w:pPr>
-    </w:lvl>
-    <w:lvl w:ilvl="7" w:tplc="7CCABD9C">
-      <w:start w:val="1"/>
-      <w:numFmt w:val="bullet"/>
-      <w:lvlText w:val="●"/>
-      <w:lvlJc w:val="left"/>
-      <w:pPr>
-        <w:ind w:left="5760" w:hanging="360"/>
-      </w:pPr>
-    </w:lvl>
-    <w:lvl w:ilvl="8" w:tplc="B300A2C2">
-      <w:start w:val="1"/>
-      <w:numFmt w:val="bullet"/>
-      <w:lvlText w:val="●"/>
-      <w:lvlJc w:val="left"/>
-      <w:pPr>
-        <w:ind w:left="6480" w:hanging="360"/>
-      </w:pPr>
-    </w:lvl>
-  </w:abstractNum>
-  <w:abstractNum w:abstractNumId="2" w15:restartNumberingAfterBreak="0">
-    <w:nsid w:val="53DA1951"/>
-    <w:multiLevelType w:val="hybridMultilevel"/>
-    <w:tmpl w:val="E1F2C570"/>
-    <w:lvl w:ilvl="0" w:tplc="F300EF26">
+    <w:tmpl w:val="38B00D6E"/>
+    <w:lvl w:ilvl="0" w:tplc="B6D6A7BE">
       <w:start w:val="1"/>
       <w:numFmt w:val="bullet"/>
       <w:lvlText w:val="•"/>
@@ -8166,7 +9541,7 @@
         <w:ind w:left="720" w:hanging="360"/>
       </w:pPr>
     </w:lvl>
-    <w:lvl w:ilvl="1" w:tplc="11CE77F0">
+    <w:lvl w:ilvl="1" w:tplc="BFE8C150">
       <w:start w:val="1"/>
       <w:numFmt w:val="bullet"/>
       <w:lvlText w:val="◦"/>
@@ -8175,49 +9550,49 @@
         <w:ind w:left="1440" w:hanging="360"/>
       </w:pPr>
     </w:lvl>
-    <w:lvl w:ilvl="2" w:tplc="C0B2F2E2">
+    <w:lvl w:ilvl="2" w:tplc="C1266DA0">
       <w:numFmt w:val="decimal"/>
       <w:lvlText w:val=""/>
       <w:lvlJc w:val="left"/>
     </w:lvl>
-    <w:lvl w:ilvl="3" w:tplc="76D677B6">
+    <w:lvl w:ilvl="3" w:tplc="18D88C48">
       <w:numFmt w:val="decimal"/>
       <w:lvlText w:val=""/>
       <w:lvlJc w:val="left"/>
     </w:lvl>
-    <w:lvl w:ilvl="4" w:tplc="E19A5044">
+    <w:lvl w:ilvl="4" w:tplc="4A725ECA">
       <w:numFmt w:val="decimal"/>
       <w:lvlText w:val=""/>
       <w:lvlJc w:val="left"/>
     </w:lvl>
-    <w:lvl w:ilvl="5" w:tplc="C896CB4C">
+    <w:lvl w:ilvl="5" w:tplc="D6866DD4">
       <w:numFmt w:val="decimal"/>
       <w:lvlText w:val=""/>
       <w:lvlJc w:val="left"/>
     </w:lvl>
-    <w:lvl w:ilvl="6" w:tplc="D0A62ADA">
+    <w:lvl w:ilvl="6" w:tplc="DBA616FC">
       <w:numFmt w:val="decimal"/>
       <w:lvlText w:val=""/>
       <w:lvlJc w:val="left"/>
     </w:lvl>
-    <w:lvl w:ilvl="7" w:tplc="7BC4B376">
+    <w:lvl w:ilvl="7" w:tplc="3874043E">
       <w:numFmt w:val="decimal"/>
       <w:lvlText w:val=""/>
       <w:lvlJc w:val="left"/>
     </w:lvl>
-    <w:lvl w:ilvl="8" w:tplc="6DB89090">
+    <w:lvl w:ilvl="8" w:tplc="1D6C0336">
       <w:numFmt w:val="decimal"/>
       <w:lvlText w:val=""/>
       <w:lvlJc w:val="left"/>
     </w:lvl>
   </w:abstractNum>
-  <w:num w:numId="1" w16cid:durableId="1838763002">
-    <w:abstractNumId w:val="1"/>
+  <w:num w:numId="1" w16cid:durableId="1573199549">
+    <w:abstractNumId w:val="0"/>
     <w:lvlOverride w:ilvl="0">
       <w:startOverride w:val="1"/>
     </w:lvlOverride>
   </w:num>
-  <w:num w:numId="2" w16cid:durableId="1780831260">
+  <w:num w:numId="2" w16cid:durableId="1256016273">
     <w:abstractNumId w:val="2"/>
     <w:lvlOverride w:ilvl="0">
       <w:startOverride w:val="1"/>
@@ -8839,7 +10214,7 @@
     <w:autoRedefine/>
     <w:uiPriority w:val="39"/>
     <w:unhideWhenUsed/>
-    <w:rsid w:val="00687E94"/>
+    <w:rsid w:val="003573C7"/>
     <w:pPr>
       <w:spacing w:after="100"/>
     </w:pPr>
@@ -8851,7 +10226,7 @@
     <w:autoRedefine/>
     <w:uiPriority w:val="39"/>
     <w:unhideWhenUsed/>
-    <w:rsid w:val="00687E94"/>
+    <w:rsid w:val="003573C7"/>
     <w:pPr>
       <w:spacing w:after="100"/>
       <w:ind w:left="220"/>
@@ -8864,7 +10239,7 @@
     <w:autoRedefine/>
     <w:uiPriority w:val="39"/>
     <w:unhideWhenUsed/>
-    <w:rsid w:val="00687E94"/>
+    <w:rsid w:val="003573C7"/>
     <w:pPr>
       <w:spacing w:after="100"/>
       <w:ind w:left="440"/>

</xml_diff>